<commit_message>
doc(CDC/Rapport): Mise à jour
[33][Done]
</commit_message>
<xml_diff>
--- a/doc/E-P_Web294-CDC.docx
+++ b/doc/E-P_Web294-CDC.docx
@@ -1,6 +1,6 @@
 
 <file path=word/document.xml><?xml version="1.0" encoding="utf-8"?>
-<w:document xmlns:wpc="http://schemas.microsoft.com/office/word/2010/wordprocessingCanvas" xmlns:cx="http://schemas.microsoft.com/office/drawing/2014/chartex" xmlns:cx1="http://schemas.microsoft.com/office/drawing/2015/9/8/chartex" xmlns:cx2="http://schemas.microsoft.com/office/drawing/2015/10/21/chartex" xmlns:cx3="http://schemas.microsoft.com/office/drawing/2016/5/9/chartex" xmlns:cx4="http://schemas.microsoft.com/office/drawing/2016/5/10/chartex" xmlns:cx5="http://schemas.microsoft.com/office/drawing/2016/5/11/chartex" xmlns:cx6="http://schemas.microsoft.com/office/drawing/2016/5/12/chartex" xmlns:cx7="http://schemas.microsoft.com/office/drawing/2016/5/13/chartex" xmlns:cx8="http://schemas.microsoft.com/office/drawing/2016/5/14/chartex" xmlns:mc="http://schemas.openxmlformats.org/markup-compatibility/2006" xmlns:aink="http://schemas.microsoft.com/office/drawing/2016/ink" xmlns:am3d="http://schemas.microsoft.com/office/drawing/2017/model3d" xmlns:o="urn:schemas-microsoft-com:office:office" xmlns:oel="http://schemas.microsoft.com/office/2019/extlst" xmlns:r="http://schemas.openxmlformats.org/officeDocument/2006/relationships" xmlns:m="http://schemas.openxmlformats.org/officeDocument/2006/math" xmlns:v="urn:schemas-microsoft-com:vml" xmlns:wp14="http://schemas.microsoft.com/office/word/2010/wordprocessingDrawing" xmlns:wp="http://schemas.openxmlformats.org/drawingml/2006/wordprocessingDrawing" xmlns:w10="urn:schemas-microsoft-com:office:word" xmlns:w="http://schemas.openxmlformats.org/wordprocessingml/2006/main" xmlns:w14="http://schemas.microsoft.com/office/word/2010/wordml" xmlns:w15="http://schemas.microsoft.com/office/word/2012/wordml" xmlns:w16cex="http://schemas.microsoft.com/office/word/2018/wordml/cex" xmlns:w16cid="http://schemas.microsoft.com/office/word/2016/wordml/cid" xmlns:w16="http://schemas.microsoft.com/office/word/2018/wordml" xmlns:w16du="http://schemas.microsoft.com/office/word/2023/wordml/word16du" xmlns:w16sdtdh="http://schemas.microsoft.com/office/word/2020/wordml/sdtdatahash" xmlns:w16sdtfl="http://schemas.microsoft.com/office/word/2024/wordml/sdtformatlock" xmlns:w16se="http://schemas.microsoft.com/office/word/2015/wordml/symex" xmlns:wpg="http://schemas.microsoft.com/office/word/2010/wordprocessingGroup" xmlns:wpi="http://schemas.microsoft.com/office/word/2010/wordprocessingInk" xmlns:wne="http://schemas.microsoft.com/office/word/2006/wordml" xmlns:wps="http://schemas.microsoft.com/office/word/2010/wordprocessingShape" mc:Ignorable="w14 w15 w16se w16cid w16 w16cex w16sdtdh w16sdtfl w16du wp14">
+<w:document xmlns:wpc="http://schemas.microsoft.com/office/word/2010/wordprocessingCanvas" xmlns:cx="http://schemas.microsoft.com/office/drawing/2014/chartex" xmlns:cx1="http://schemas.microsoft.com/office/drawing/2015/9/8/chartex" xmlns:cx2="http://schemas.microsoft.com/office/drawing/2015/10/21/chartex" xmlns:cx3="http://schemas.microsoft.com/office/drawing/2016/5/9/chartex" xmlns:cx4="http://schemas.microsoft.com/office/drawing/2016/5/10/chartex" xmlns:cx5="http://schemas.microsoft.com/office/drawing/2016/5/11/chartex" xmlns:cx6="http://schemas.microsoft.com/office/drawing/2016/5/12/chartex" xmlns:cx7="http://schemas.microsoft.com/office/drawing/2016/5/13/chartex" xmlns:cx8="http://schemas.microsoft.com/office/drawing/2016/5/14/chartex" xmlns:mc="http://schemas.openxmlformats.org/markup-compatibility/2006" xmlns:aink="http://schemas.microsoft.com/office/drawing/2016/ink" xmlns:am3d="http://schemas.microsoft.com/office/drawing/2017/model3d" xmlns:o="urn:schemas-microsoft-com:office:office" xmlns:oel="http://schemas.microsoft.com/office/2019/extlst" xmlns:r="http://schemas.openxmlformats.org/officeDocument/2006/relationships" xmlns:m="http://schemas.openxmlformats.org/officeDocument/2006/math" xmlns:v="urn:schemas-microsoft-com:vml" xmlns:wp14="http://schemas.microsoft.com/office/word/2010/wordprocessingDrawing" xmlns:wp="http://schemas.openxmlformats.org/drawingml/2006/wordprocessingDrawing" xmlns:w10="urn:schemas-microsoft-com:office:word" xmlns:w="http://schemas.openxmlformats.org/wordprocessingml/2006/main" xmlns:w14="http://schemas.microsoft.com/office/word/2010/wordml" xmlns:w15="http://schemas.microsoft.com/office/word/2012/wordml" xmlns:w16cex="http://schemas.microsoft.com/office/word/2018/wordml/cex" xmlns:w16cid="http://schemas.microsoft.com/office/word/2016/wordml/cid" xmlns:w16="http://schemas.microsoft.com/office/word/2018/wordml" xmlns:w16sdtdh="http://schemas.microsoft.com/office/word/2020/wordml/sdtdatahash" xmlns:w16se="http://schemas.microsoft.com/office/word/2015/wordml/symex" xmlns:wpg="http://schemas.microsoft.com/office/word/2010/wordprocessingGroup" xmlns:wpi="http://schemas.microsoft.com/office/word/2010/wordprocessingInk" xmlns:wne="http://schemas.microsoft.com/office/word/2006/wordml" xmlns:wps="http://schemas.microsoft.com/office/word/2010/wordprocessingShape" mc:Ignorable="w14 w15 w16se w16cid w16 w16cex w16sdtdh wp14">
   <w:body>
     <w:p>
       <w:pPr>
@@ -22,12 +22,12 @@
         <w:tblW w:w="0" w:type="auto"/>
         <w:jc w:val="center"/>
         <w:tblBorders>
-          <w:top w:val="single" w:color="auto" w:sz="4" w:space="0"/>
-          <w:left w:val="single" w:color="auto" w:sz="4" w:space="0"/>
-          <w:bottom w:val="single" w:color="auto" w:sz="4" w:space="0"/>
-          <w:right w:val="single" w:color="auto" w:sz="4" w:space="0"/>
-          <w:insideH w:val="single" w:color="auto" w:sz="4" w:space="0"/>
-          <w:insideV w:val="single" w:color="auto" w:sz="4" w:space="0"/>
+          <w:top w:val="single" w:sz="4" w:space="0" w:color="auto"/>
+          <w:left w:val="single" w:sz="4" w:space="0" w:color="auto"/>
+          <w:bottom w:val="single" w:sz="4" w:space="0" w:color="auto"/>
+          <w:right w:val="single" w:sz="4" w:space="0" w:color="auto"/>
+          <w:insideH w:val="single" w:sz="4" w:space="0" w:color="auto"/>
+          <w:insideV w:val="single" w:sz="4" w:space="0" w:color="auto"/>
         </w:tblBorders>
         <w:tblLayout w:type="fixed"/>
         <w:tblLook w:val="01E0" w:firstRow="1" w:lastRow="1" w:firstColumn="1" w:lastColumn="1" w:noHBand="0" w:noVBand="0"/>
@@ -40,11 +40,11 @@
       <w:tr>
         <w:trPr>
           <w:trHeight w:val="260"/>
+          <w:jc w:val="center"/>
         </w:trPr>
         <w:tc>
           <w:tcPr>
             <w:tcW w:w="3227" w:type="dxa"/>
-            <w:tcMar/>
           </w:tcPr>
           <w:p>
             <w:pPr>
@@ -64,7 +64,6 @@
         <w:tc>
           <w:tcPr>
             <w:tcW w:w="3685" w:type="dxa"/>
-            <w:tcMar/>
           </w:tcPr>
           <w:p>
             <w:pPr>
@@ -77,26 +76,29 @@
                 <w:rFonts w:ascii="Century Gothic" w:hAnsi="Century Gothic"/>
               </w:rPr>
             </w:pPr>
-            <w:proofErr w:type="gramStart"/>
             <w:r>
               <w:rPr>
                 <w:rFonts w:ascii="Century Gothic" w:hAnsi="Century Gothic"/>
               </w:rPr>
               <w:t>Nom:</w:t>
             </w:r>
-            <w:proofErr w:type="gramEnd"/>
             <w:r>
               <w:rPr>
                 <w:rFonts w:ascii="Century Gothic" w:hAnsi="Century Gothic"/>
               </w:rPr>
               <w:tab/>
+            </w:r>
+            <w:r>
+              <w:rPr>
+                <w:rFonts w:ascii="Century Gothic" w:hAnsi="Century Gothic"/>
+              </w:rPr>
+              <w:t xml:space="preserve">Junod &amp; Darbellay </w:t>
             </w:r>
           </w:p>
         </w:tc>
         <w:tc>
           <w:tcPr>
             <w:tcW w:w="3048" w:type="dxa"/>
-            <w:tcMar/>
           </w:tcPr>
           <w:p>
             <w:pPr>
@@ -114,17 +116,23 @@
               </w:rPr>
               <w:t>Prénom :</w:t>
             </w:r>
+            <w:r>
+              <w:rPr>
+                <w:rFonts w:ascii="Century Gothic" w:hAnsi="Century Gothic"/>
+              </w:rPr>
+              <w:t xml:space="preserve"> Jonathan &amp; Néo</w:t>
+            </w:r>
           </w:p>
         </w:tc>
       </w:tr>
       <w:tr>
         <w:trPr>
           <w:trHeight w:val="260"/>
+          <w:jc w:val="center"/>
         </w:trPr>
         <w:tc>
           <w:tcPr>
             <w:tcW w:w="3227" w:type="dxa"/>
-            <w:tcMar/>
           </w:tcPr>
           <w:p>
             <w:pPr>
@@ -145,7 +153,6 @@
           <w:tcPr>
             <w:tcW w:w="6733" w:type="dxa"/>
             <w:gridSpan w:val="2"/>
-            <w:tcMar/>
           </w:tcPr>
           <w:p>
             <w:pPr>
@@ -173,49 +180,19 @@
               <w:rPr>
                 <w:rFonts w:ascii="Century Gothic" w:hAnsi="Century Gothic"/>
               </w:rPr>
-              <w:t xml:space="preserve">   </w:t>
-            </w:r>
-            <w:r>
-              <w:rPr>
-                <w:rFonts w:ascii="Century Gothic" w:hAnsi="Century Gothic"/>
-              </w:rPr>
-              <w:t xml:space="preserve">/  </w:t>
-            </w:r>
-            <w:r>
-              <w:rPr>
-                <w:rFonts w:ascii="Century Gothic" w:hAnsi="Century Gothic"/>
-              </w:rPr>
-              <w:t>Valmont</w:t>
-            </w:r>
-            <w:r>
-              <w:rPr>
-                <w:rFonts w:ascii="Century Gothic" w:hAnsi="Century Gothic"/>
-              </w:rPr>
-              <w:t xml:space="preserve"> 28b</w:t>
-            </w:r>
-            <w:r>
-              <w:rPr>
-                <w:rFonts w:ascii="Century Gothic" w:hAnsi="Century Gothic"/>
-              </w:rPr>
-              <w:t xml:space="preserve"> </w:t>
-            </w:r>
-            <w:r>
-              <w:rPr>
-                <w:rFonts w:ascii="Century Gothic" w:hAnsi="Century Gothic"/>
-              </w:rPr>
-              <w:t>/</w:t>
-            </w:r>
-            <w:r>
-              <w:rPr>
-                <w:rFonts w:ascii="Century Gothic" w:hAnsi="Century Gothic"/>
-              </w:rPr>
-              <w:t xml:space="preserve">  1004</w:t>
-            </w:r>
-            <w:r>
-              <w:rPr>
-                <w:rFonts w:ascii="Century Gothic" w:hAnsi="Century Gothic"/>
-              </w:rPr>
-              <w:t xml:space="preserve"> LAUSANNE</w:t>
+              <w:t xml:space="preserve">   /  </w:t>
+            </w:r>
+            <w:r>
+              <w:rPr>
+                <w:rFonts w:ascii="Century Gothic" w:hAnsi="Century Gothic"/>
+              </w:rPr>
+              <w:t>Valmont 28b</w:t>
+            </w:r>
+            <w:r>
+              <w:rPr>
+                <w:rFonts w:ascii="Century Gothic" w:hAnsi="Century Gothic"/>
+              </w:rPr>
+              <w:t xml:space="preserve"> /  1004 LAUSANNE</w:t>
             </w:r>
           </w:p>
         </w:tc>
@@ -223,11 +200,11 @@
       <w:tr>
         <w:trPr>
           <w:trHeight w:val="260"/>
+          <w:jc w:val="center"/>
         </w:trPr>
         <w:tc>
           <w:tcPr>
             <w:tcW w:w="3227" w:type="dxa"/>
-            <w:tcMar/>
           </w:tcPr>
           <w:p>
             <w:pPr>
@@ -248,9 +225,8 @@
           <w:tcPr>
             <w:tcW w:w="3685" w:type="dxa"/>
             <w:tcBorders>
-              <w:bottom w:val="single" w:color="auto" w:sz="4" w:space="0"/>
+              <w:bottom w:val="single" w:sz="4" w:space="0" w:color="auto"/>
             </w:tcBorders>
-            <w:tcMar/>
           </w:tcPr>
           <w:p>
             <w:pPr>
@@ -263,26 +239,29 @@
                 <w:rFonts w:ascii="Century Gothic" w:hAnsi="Century Gothic"/>
               </w:rPr>
             </w:pPr>
-            <w:proofErr w:type="gramStart"/>
             <w:r>
               <w:rPr>
                 <w:rFonts w:ascii="Century Gothic" w:hAnsi="Century Gothic"/>
               </w:rPr>
               <w:t>Nom:</w:t>
             </w:r>
-            <w:proofErr w:type="gramEnd"/>
             <w:r>
               <w:rPr>
                 <w:rFonts w:ascii="Century Gothic" w:hAnsi="Century Gothic"/>
               </w:rPr>
               <w:tab/>
+            </w:r>
+            <w:r>
+              <w:rPr>
+                <w:rFonts w:ascii="Century Gothic" w:hAnsi="Century Gothic"/>
+              </w:rPr>
+              <w:t>Charmier</w:t>
             </w:r>
           </w:p>
         </w:tc>
         <w:tc>
           <w:tcPr>
             <w:tcW w:w="3048" w:type="dxa"/>
-            <w:tcMar/>
             <w:vAlign w:val="center"/>
           </w:tcPr>
           <w:p>
@@ -296,7 +275,6 @@
                 <w:b w:val="0"/>
               </w:rPr>
             </w:pPr>
-            <w:proofErr w:type="gramStart"/>
             <w:r>
               <w:rPr>
                 <w:rFonts w:ascii="Century Gothic" w:hAnsi="Century Gothic"/>
@@ -319,7 +297,6 @@
               </w:rPr>
               <w:t>:</w:t>
             </w:r>
-            <w:proofErr w:type="gramEnd"/>
             <w:r>
               <w:rPr>
                 <w:rFonts w:ascii="Century Gothic" w:hAnsi="Century Gothic"/>
@@ -332,7 +309,7 @@
                 <w:rFonts w:ascii="Century Gothic" w:hAnsi="Century Gothic"/>
                 <w:b w:val="0"/>
               </w:rPr>
-              <w:t>-</w:t>
+              <w:t>Grégory</w:t>
             </w:r>
           </w:p>
         </w:tc>
@@ -340,11 +317,11 @@
       <w:tr>
         <w:trPr>
           <w:trHeight w:val="260"/>
+          <w:jc w:val="center"/>
         </w:trPr>
         <w:tc>
           <w:tcPr>
             <w:tcW w:w="3227" w:type="dxa"/>
-            <w:tcMar/>
           </w:tcPr>
           <w:p>
             <w:pPr>
@@ -371,14 +348,13 @@
           <w:tcPr>
             <w:tcW w:w="6733" w:type="dxa"/>
             <w:gridSpan w:val="2"/>
-            <w:tcMar/>
           </w:tcPr>
           <w:p>
             <w:pPr>
               <w:pStyle w:val="TexteTableau"/>
               <w:tabs>
-                <w:tab w:val="left" w:leader="none" w:pos="1080"/>
-                <w:tab w:val="left" w:leader="none" w:pos="1167"/>
+                <w:tab w:val="left" w:pos="1080"/>
+                <w:tab w:val="left" w:pos="1167"/>
               </w:tabs>
               <w:rPr>
                 <w:rFonts w:ascii="Century Gothic" w:hAnsi="Century Gothic"/>
@@ -394,7 +370,7 @@
               <w:rPr>
                 <w:rFonts w:ascii="Century Gothic" w:hAnsi="Century Gothic"/>
               </w:rPr>
-              <w:t>XXX</w:t>
+              <w:t>12.01.2026</w:t>
             </w:r>
             <w:r>
               <w:rPr>
@@ -406,7 +382,7 @@
               <w:rPr>
                 <w:rFonts w:ascii="Century Gothic" w:hAnsi="Century Gothic"/>
               </w:rPr>
-              <w:t>YYY</w:t>
+              <w:t>11.03.2026</w:t>
             </w:r>
           </w:p>
         </w:tc>
@@ -414,11 +390,11 @@
       <w:tr>
         <w:trPr>
           <w:trHeight w:val="260"/>
+          <w:jc w:val="center"/>
         </w:trPr>
         <w:tc>
           <w:tcPr>
             <w:tcW w:w="3227" w:type="dxa"/>
-            <w:tcMar/>
           </w:tcPr>
           <w:p>
             <w:pPr>
@@ -452,18 +428,13 @@
             <w:tcW w:w="6733" w:type="dxa"/>
             <w:gridSpan w:val="2"/>
             <w:tcBorders>
-              <w:bottom w:val="single" w:color="auto" w:sz="4" w:space="0"/>
+              <w:bottom w:val="single" w:sz="4" w:space="0" w:color="auto"/>
             </w:tcBorders>
-            <w:tcMar/>
           </w:tcPr>
           <w:p>
             <w:pPr>
               <w:pStyle w:val="TexteTableau"/>
-              <w:suppressLineNumbers w:val="0"/>
-              <w:bidi w:val="0"/>
-              <w:spacing w:before="60" w:beforeAutospacing="off" w:after="0" w:afterAutospacing="off" w:line="240" w:lineRule="auto"/>
-              <w:ind w:left="0" w:right="0"/>
-              <w:jc w:val="left"/>
+              <w:spacing w:after="0"/>
               <w:rPr>
                 <w:rFonts w:ascii="Century Gothic" w:hAnsi="Century Gothic"/>
               </w:rPr>
@@ -492,14 +463,14 @@
       <w:tr>
         <w:trPr>
           <w:trHeight w:val="260"/>
+          <w:jc w:val="center"/>
         </w:trPr>
         <w:tc>
           <w:tcPr>
             <w:tcW w:w="3227" w:type="dxa"/>
             <w:tcBorders>
-              <w:bottom w:val="single" w:color="auto" w:sz="4" w:space="0"/>
+              <w:bottom w:val="single" w:sz="4" w:space="0" w:color="auto"/>
             </w:tcBorders>
-            <w:tcMar/>
           </w:tcPr>
           <w:p>
             <w:pPr>
@@ -533,9 +504,8 @@
             <w:tcW w:w="6733" w:type="dxa"/>
             <w:gridSpan w:val="2"/>
             <w:tcBorders>
-              <w:bottom w:val="single" w:color="auto" w:sz="4" w:space="0"/>
+              <w:bottom w:val="single" w:sz="4" w:space="0" w:color="auto"/>
             </w:tcBorders>
-            <w:tcMar/>
           </w:tcPr>
           <w:p>
             <w:pPr>
@@ -842,26 +812,12 @@
           <w:rFonts w:ascii="Century Gothic" w:hAnsi="Century Gothic"/>
         </w:rPr>
       </w:pPr>
-      <w:bookmarkStart w:name="_Hlk98921667" w:id="0"/>
-      <w:r>
-        <w:rPr>
-          <w:rFonts w:ascii="Century Gothic" w:hAnsi="Century Gothic"/>
-        </w:rPr>
-        <w:t xml:space="preserve">Chaque apprenti travaille sur tous les aspects du projet (code, documentation, tests, </w:t>
-      </w:r>
-      <w:proofErr w:type="spellStart"/>
-      <w:r>
-        <w:rPr>
-          <w:rFonts w:ascii="Century Gothic" w:hAnsi="Century Gothic"/>
-        </w:rPr>
-        <w:t>etc</w:t>
-      </w:r>
-      <w:proofErr w:type="spellEnd"/>
-      <w:r>
-        <w:rPr>
-          <w:rFonts w:ascii="Century Gothic" w:hAnsi="Century Gothic"/>
-        </w:rPr>
-        <w:t>)</w:t>
+      <w:bookmarkStart w:id="0" w:name="_Hlk98921667"/>
+      <w:r>
+        <w:rPr>
+          <w:rFonts w:ascii="Century Gothic" w:hAnsi="Century Gothic"/>
+        </w:rPr>
+        <w:t>Chaque apprenti travaille sur tous les aspects du projet (code, documentation, tests, etc)</w:t>
       </w:r>
     </w:p>
     <w:bookmarkEnd w:id="0"/>
@@ -1063,16 +1019,12 @@
                 <w:rFonts w:ascii="Century Gothic" w:hAnsi="Century Gothic"/>
               </w:rPr>
             </w:pPr>
-            <w:proofErr w:type="spellStart"/>
-            <w:proofErr w:type="gramStart"/>
             <w:r>
               <w:rPr>
                 <w:rFonts w:ascii="Century Gothic" w:hAnsi="Century Gothic"/>
               </w:rPr>
               <w:t>vscode</w:t>
             </w:r>
-            <w:proofErr w:type="spellEnd"/>
-            <w:proofErr w:type="gramEnd"/>
           </w:p>
           <w:p>
             <w:pPr>
@@ -1343,6 +1295,7 @@
         <w:rPr>
           <w:rFonts w:ascii="Century Gothic" w:hAnsi="Century Gothic"/>
         </w:rPr>
+        <w:lastRenderedPageBreak/>
         <w:t>CAHIER DES CHARGES</w:t>
       </w:r>
     </w:p>
@@ -1603,8 +1556,7 @@
               </w:rPr>
               <w:t xml:space="preserve">allons utiliser </w:t>
             </w:r>
-            <w:hyperlink w:history="1" r:id="rId8">
-              <w:proofErr w:type="spellStart"/>
+            <w:hyperlink r:id="rId8" w:history="1">
               <w:r>
                 <w:rPr>
                   <w:rStyle w:val="Lienhypertexte"/>
@@ -1612,17 +1564,7 @@
                   <w:sz w:val="22"/>
                   <w:lang w:val="fr-CH" w:eastAsia="fr-CH"/>
                 </w:rPr>
-                <w:t>My</w:t>
-              </w:r>
-              <w:proofErr w:type="spellEnd"/>
-              <w:r>
-                <w:rPr>
-                  <w:rStyle w:val="Lienhypertexte"/>
-                  <w:rFonts w:ascii="Century Gothic" w:hAnsi="Century Gothic"/>
-                  <w:sz w:val="22"/>
-                  <w:lang w:val="fr-CH" w:eastAsia="fr-CH"/>
-                </w:rPr>
-                <w:t xml:space="preserve"> JSON Server</w:t>
+                <w:t>My JSON Server</w:t>
               </w:r>
             </w:hyperlink>
             <w:r>
@@ -1630,23 +1572,7 @@
                 <w:rFonts w:ascii="Century Gothic" w:hAnsi="Century Gothic"/>
                 <w:lang w:val="fr-CH" w:eastAsia="fr-CH"/>
               </w:rPr>
-              <w:t xml:space="preserve"> (basé sur le célèbre outil </w:t>
-            </w:r>
-            <w:proofErr w:type="spellStart"/>
-            <w:r>
-              <w:rPr>
-                <w:rFonts w:ascii="Century Gothic" w:hAnsi="Century Gothic"/>
-                <w:lang w:val="fr-CH" w:eastAsia="fr-CH"/>
-              </w:rPr>
-              <w:t>json</w:t>
-            </w:r>
-            <w:proofErr w:type="spellEnd"/>
-            <w:r>
-              <w:rPr>
-                <w:rFonts w:ascii="Century Gothic" w:hAnsi="Century Gothic"/>
-                <w:lang w:val="fr-CH" w:eastAsia="fr-CH"/>
-              </w:rPr>
-              <w:t xml:space="preserve">-server) </w:t>
+              <w:t xml:space="preserve"> (basé sur le célèbre outil json-server) </w:t>
             </w:r>
             <w:r>
               <w:rPr>
@@ -1774,16 +1700,8 @@
               <w:rPr>
                 <w:rFonts w:ascii="Century Gothic" w:hAnsi="Century Gothic"/>
               </w:rPr>
-              <w:t xml:space="preserve"> un outil comme </w:t>
-            </w:r>
-            <w:proofErr w:type="spellStart"/>
-            <w:r>
-              <w:rPr>
-                <w:rFonts w:ascii="Century Gothic" w:hAnsi="Century Gothic"/>
-              </w:rPr>
-              <w:t>Figma</w:t>
-            </w:r>
-            <w:proofErr w:type="spellEnd"/>
+              <w:t xml:space="preserve"> un outil comme Figma</w:t>
+            </w:r>
             <w:r>
               <w:rPr>
                 <w:rFonts w:ascii="Century Gothic" w:hAnsi="Century Gothic"/>
@@ -2295,7 +2213,7 @@
           <w:b/>
         </w:rPr>
       </w:pPr>
-      <w:bookmarkStart w:name="_Ref237771512" w:id="1"/>
+      <w:bookmarkStart w:id="1" w:name="_Ref237771512"/>
       <w:r>
         <w:rPr>
           <w:rStyle w:val="Titre2Car"/>
@@ -2509,6 +2427,7 @@
               <w:rPr>
                 <w:rFonts w:ascii="Century Gothic" w:hAnsi="Century Gothic"/>
               </w:rPr>
+              <w:lastRenderedPageBreak/>
               <w:t xml:space="preserve">Un </w:t>
             </w:r>
             <w:r>
@@ -2548,19 +2467,11 @@
               </w:rPr>
               <w:t xml:space="preserve"> (lien relatif vers un fichier </w:t>
             </w:r>
-            <w:proofErr w:type="spellStart"/>
-            <w:r>
-              <w:rPr>
-                <w:rFonts w:ascii="Century Gothic" w:hAnsi="Century Gothic"/>
-              </w:rPr>
-              <w:t>pdf</w:t>
-            </w:r>
-            <w:proofErr w:type="spellEnd"/>
-            <w:r>
-              <w:rPr>
-                <w:rFonts w:ascii="Century Gothic" w:hAnsi="Century Gothic"/>
-              </w:rPr>
-              <w:t xml:space="preserve"> d’une page d</w:t>
+            <w:r>
+              <w:rPr>
+                <w:rFonts w:ascii="Century Gothic" w:hAnsi="Century Gothic"/>
+              </w:rPr>
+              <w:t>pdf d’une page d</w:t>
             </w:r>
             <w:r>
               <w:rPr>
@@ -3068,6 +2979,7 @@
           <w:rFonts w:ascii="Century Gothic" w:hAnsi="Century Gothic"/>
           <w:b/>
         </w:rPr>
+        <w:lastRenderedPageBreak/>
         <w:t>Les technologies</w:t>
       </w:r>
     </w:p>
@@ -3194,16 +3106,8 @@
         <w:rPr>
           <w:rFonts w:ascii="Century Gothic" w:hAnsi="Century Gothic"/>
         </w:rPr>
-        <w:t xml:space="preserve"> et </w:t>
-      </w:r>
-      <w:proofErr w:type="spellStart"/>
-      <w:r>
-        <w:rPr>
-          <w:rFonts w:ascii="Century Gothic" w:hAnsi="Century Gothic"/>
-        </w:rPr>
-        <w:t>github</w:t>
-      </w:r>
-      <w:proofErr w:type="spellEnd"/>
+        <w:t xml:space="preserve"> et github</w:t>
+      </w:r>
     </w:p>
     <w:p>
       <w:pPr>
@@ -3217,19 +3121,11 @@
           <w:rFonts w:ascii="Century Gothic" w:hAnsi="Century Gothic"/>
         </w:rPr>
       </w:pPr>
-      <w:proofErr w:type="spellStart"/>
-      <w:r>
-        <w:rPr>
-          <w:rFonts w:ascii="Century Gothic" w:hAnsi="Century Gothic"/>
-        </w:rPr>
-        <w:t>Json</w:t>
-      </w:r>
-      <w:proofErr w:type="spellEnd"/>
-      <w:r>
-        <w:rPr>
-          <w:rFonts w:ascii="Century Gothic" w:hAnsi="Century Gothic"/>
-        </w:rPr>
-        <w:t xml:space="preserve"> server</w:t>
+      <w:r>
+        <w:rPr>
+          <w:rFonts w:ascii="Century Gothic" w:hAnsi="Century Gothic"/>
+        </w:rPr>
+        <w:t>Json server</w:t>
       </w:r>
     </w:p>
     <w:p>
@@ -3252,6 +3148,7 @@
           <w:rFonts w:ascii="Century Gothic" w:hAnsi="Century Gothic"/>
           <w:b/>
         </w:rPr>
+        <w:lastRenderedPageBreak/>
         <w:t>Travail à réaliser par les apprentis dans le cadre de ce projet</w:t>
       </w:r>
       <w:bookmarkEnd w:id="1"/>
@@ -3411,21 +3308,7 @@
         <w:rPr>
           <w:rFonts w:ascii="Century Gothic" w:hAnsi="Century Gothic"/>
         </w:rPr>
-        <w:t>Planification de toutes les tâches à réaliser : Vous devez utiliser un outil permettant au chef de projet de voir l’évolution des tâches (</w:t>
-      </w:r>
-      <w:proofErr w:type="spellStart"/>
-      <w:r>
-        <w:rPr>
-          <w:rFonts w:ascii="Century Gothic" w:hAnsi="Century Gothic"/>
-        </w:rPr>
-        <w:t>github</w:t>
-      </w:r>
-      <w:proofErr w:type="spellEnd"/>
-      <w:r>
-        <w:rPr>
-          <w:rFonts w:ascii="Century Gothic" w:hAnsi="Century Gothic"/>
-        </w:rPr>
-        <w:t xml:space="preserve"> projet)</w:t>
+        <w:t>Planification de toutes les tâches à réaliser : Vous devez utiliser un outil permettant au chef de projet de voir l’évolution des tâches (github projet)</w:t>
       </w:r>
       <w:r>
         <w:rPr>
@@ -3564,16 +3447,8 @@
         <w:rPr>
           <w:rFonts w:ascii="Century Gothic" w:hAnsi="Century Gothic"/>
         </w:rPr>
-        <w:t>Comprend une explication de l’organisation du groupe quant à la gestion du code avec git/</w:t>
-      </w:r>
-      <w:proofErr w:type="spellStart"/>
-      <w:r>
-        <w:rPr>
-          <w:rFonts w:ascii="Century Gothic" w:hAnsi="Century Gothic"/>
-        </w:rPr>
-        <w:t>github</w:t>
-      </w:r>
-      <w:proofErr w:type="spellEnd"/>
+        <w:t>Comprend une explication de l’organisation du groupe quant à la gestion du code avec git/github</w:t>
+      </w:r>
       <w:r>
         <w:rPr>
           <w:rFonts w:ascii="Century Gothic" w:hAnsi="Century Gothic"/>
@@ -3690,8 +3565,8 @@
       <w:r>
         <w:rPr>
           <w:rFonts w:ascii="Century Gothic" w:hAnsi="Century Gothic"/>
-          <w:b w:val="1"/>
-          <w:bCs w:val="1"/>
+          <w:b/>
+          <w:bCs/>
           <w:lang w:val="fr-FR"/>
         </w:rPr>
         <w:t>Remarque</w:t>
@@ -3790,6 +3665,7 @@
           <w:rFonts w:ascii="Century Gothic" w:hAnsi="Century Gothic"/>
           <w:lang w:val="fr-FR"/>
         </w:rPr>
+        <w:lastRenderedPageBreak/>
         <w:t xml:space="preserve"> </w:t>
       </w:r>
     </w:p>
@@ -3822,12 +3698,12 @@
         <w:tblW w:w="0" w:type="auto"/>
         <w:jc w:val="center"/>
         <w:tblBorders>
-          <w:top w:val="single" w:color="auto" w:sz="4" w:space="0"/>
-          <w:left w:val="single" w:color="auto" w:sz="4" w:space="0"/>
-          <w:bottom w:val="single" w:color="auto" w:sz="4" w:space="0"/>
-          <w:right w:val="single" w:color="auto" w:sz="4" w:space="0"/>
-          <w:insideH w:val="single" w:color="auto" w:sz="4" w:space="0"/>
-          <w:insideV w:val="single" w:color="auto" w:sz="4" w:space="0"/>
+          <w:top w:val="single" w:sz="4" w:space="0" w:color="auto"/>
+          <w:left w:val="single" w:sz="4" w:space="0" w:color="auto"/>
+          <w:bottom w:val="single" w:sz="4" w:space="0" w:color="auto"/>
+          <w:right w:val="single" w:sz="4" w:space="0" w:color="auto"/>
+          <w:insideH w:val="single" w:sz="4" w:space="0" w:color="auto"/>
+          <w:insideV w:val="single" w:sz="4" w:space="0" w:color="auto"/>
         </w:tblBorders>
         <w:tblLayout w:type="fixed"/>
         <w:tblCellMar>
@@ -4223,7 +4099,7 @@
       <w:footerReference w:type="default" r:id="rId10"/>
       <w:headerReference w:type="first" r:id="rId11"/>
       <w:footerReference w:type="first" r:id="rId12"/>
-      <w:pgSz w:w="11906" w:h="16838" w:orient="portrait" w:code="9"/>
+      <w:pgSz w:w="11906" w:h="16838" w:code="9"/>
       <w:pgMar w:top="550" w:right="851" w:bottom="782" w:left="1134" w:header="567" w:footer="482" w:gutter="0"/>
       <w:cols w:space="720"/>
     </w:sectPr>
@@ -4232,7 +4108,7 @@
 </file>
 
 <file path=word/endnotes.xml><?xml version="1.0" encoding="utf-8"?>
-<w:endnotes xmlns:wpc="http://schemas.microsoft.com/office/word/2010/wordprocessingCanvas" xmlns:cx="http://schemas.microsoft.com/office/drawing/2014/chartex" xmlns:cx1="http://schemas.microsoft.com/office/drawing/2015/9/8/chartex" xmlns:cx2="http://schemas.microsoft.com/office/drawing/2015/10/21/chartex" xmlns:cx3="http://schemas.microsoft.com/office/drawing/2016/5/9/chartex" xmlns:cx4="http://schemas.microsoft.com/office/drawing/2016/5/10/chartex" xmlns:cx5="http://schemas.microsoft.com/office/drawing/2016/5/11/chartex" xmlns:cx6="http://schemas.microsoft.com/office/drawing/2016/5/12/chartex" xmlns:cx7="http://schemas.microsoft.com/office/drawing/2016/5/13/chartex" xmlns:cx8="http://schemas.microsoft.com/office/drawing/2016/5/14/chartex" xmlns:mc="http://schemas.openxmlformats.org/markup-compatibility/2006" xmlns:aink="http://schemas.microsoft.com/office/drawing/2016/ink" xmlns:am3d="http://schemas.microsoft.com/office/drawing/2017/model3d" xmlns:o="urn:schemas-microsoft-com:office:office" xmlns:oel="http://schemas.microsoft.com/office/2019/extlst" xmlns:r="http://schemas.openxmlformats.org/officeDocument/2006/relationships" xmlns:m="http://schemas.openxmlformats.org/officeDocument/2006/math" xmlns:v="urn:schemas-microsoft-com:vml" xmlns:wp14="http://schemas.microsoft.com/office/word/2010/wordprocessingDrawing" xmlns:wp="http://schemas.openxmlformats.org/drawingml/2006/wordprocessingDrawing" xmlns:w10="urn:schemas-microsoft-com:office:word" xmlns:w="http://schemas.openxmlformats.org/wordprocessingml/2006/main" xmlns:w14="http://schemas.microsoft.com/office/word/2010/wordml" xmlns:w15="http://schemas.microsoft.com/office/word/2012/wordml" xmlns:w16cex="http://schemas.microsoft.com/office/word/2018/wordml/cex" xmlns:w16cid="http://schemas.microsoft.com/office/word/2016/wordml/cid" xmlns:w16="http://schemas.microsoft.com/office/word/2018/wordml" xmlns:w16du="http://schemas.microsoft.com/office/word/2023/wordml/word16du" xmlns:w16sdtdh="http://schemas.microsoft.com/office/word/2020/wordml/sdtdatahash" xmlns:w16sdtfl="http://schemas.microsoft.com/office/word/2024/wordml/sdtformatlock" xmlns:w16se="http://schemas.microsoft.com/office/word/2015/wordml/symex" xmlns:wpg="http://schemas.microsoft.com/office/word/2010/wordprocessingGroup" xmlns:wpi="http://schemas.microsoft.com/office/word/2010/wordprocessingInk" xmlns:wne="http://schemas.microsoft.com/office/word/2006/wordml" xmlns:wps="http://schemas.microsoft.com/office/word/2010/wordprocessingShape" mc:Ignorable="w14 w15 w16se w16cid w16 w16cex w16sdtdh w16sdtfl w16du wp14">
+<w:endnotes xmlns:wpc="http://schemas.microsoft.com/office/word/2010/wordprocessingCanvas" xmlns:cx="http://schemas.microsoft.com/office/drawing/2014/chartex" xmlns:cx1="http://schemas.microsoft.com/office/drawing/2015/9/8/chartex" xmlns:cx2="http://schemas.microsoft.com/office/drawing/2015/10/21/chartex" xmlns:cx3="http://schemas.microsoft.com/office/drawing/2016/5/9/chartex" xmlns:cx4="http://schemas.microsoft.com/office/drawing/2016/5/10/chartex" xmlns:cx5="http://schemas.microsoft.com/office/drawing/2016/5/11/chartex" xmlns:cx6="http://schemas.microsoft.com/office/drawing/2016/5/12/chartex" xmlns:cx7="http://schemas.microsoft.com/office/drawing/2016/5/13/chartex" xmlns:cx8="http://schemas.microsoft.com/office/drawing/2016/5/14/chartex" xmlns:mc="http://schemas.openxmlformats.org/markup-compatibility/2006" xmlns:aink="http://schemas.microsoft.com/office/drawing/2016/ink" xmlns:am3d="http://schemas.microsoft.com/office/drawing/2017/model3d" xmlns:o="urn:schemas-microsoft-com:office:office" xmlns:oel="http://schemas.microsoft.com/office/2019/extlst" xmlns:r="http://schemas.openxmlformats.org/officeDocument/2006/relationships" xmlns:m="http://schemas.openxmlformats.org/officeDocument/2006/math" xmlns:v="urn:schemas-microsoft-com:vml" xmlns:wp14="http://schemas.microsoft.com/office/word/2010/wordprocessingDrawing" xmlns:wp="http://schemas.openxmlformats.org/drawingml/2006/wordprocessingDrawing" xmlns:w10="urn:schemas-microsoft-com:office:word" xmlns:w="http://schemas.openxmlformats.org/wordprocessingml/2006/main" xmlns:w14="http://schemas.microsoft.com/office/word/2010/wordml" xmlns:w15="http://schemas.microsoft.com/office/word/2012/wordml" xmlns:w16cex="http://schemas.microsoft.com/office/word/2018/wordml/cex" xmlns:w16cid="http://schemas.microsoft.com/office/word/2016/wordml/cid" xmlns:w16="http://schemas.microsoft.com/office/word/2018/wordml" xmlns:w16sdtdh="http://schemas.microsoft.com/office/word/2020/wordml/sdtdatahash" xmlns:w16se="http://schemas.microsoft.com/office/word/2015/wordml/symex" xmlns:wpg="http://schemas.microsoft.com/office/word/2010/wordprocessingGroup" xmlns:wpi="http://schemas.microsoft.com/office/word/2010/wordprocessingInk" xmlns:wne="http://schemas.microsoft.com/office/word/2006/wordml" xmlns:wps="http://schemas.microsoft.com/office/word/2010/wordprocessingShape" mc:Ignorable="w14 w15 w16se w16cid w16 w16cex w16sdtdh wp14">
   <w:endnote w:type="separator" w:id="-1">
     <w:p>
       <w:r>
@@ -4251,13 +4127,13 @@
 </file>
 
 <file path=word/footer1.xml><?xml version="1.0" encoding="utf-8"?>
-<w:ftr xmlns:wpc="http://schemas.microsoft.com/office/word/2010/wordprocessingCanvas" xmlns:cx="http://schemas.microsoft.com/office/drawing/2014/chartex" xmlns:cx1="http://schemas.microsoft.com/office/drawing/2015/9/8/chartex" xmlns:cx2="http://schemas.microsoft.com/office/drawing/2015/10/21/chartex" xmlns:cx3="http://schemas.microsoft.com/office/drawing/2016/5/9/chartex" xmlns:cx4="http://schemas.microsoft.com/office/drawing/2016/5/10/chartex" xmlns:cx5="http://schemas.microsoft.com/office/drawing/2016/5/11/chartex" xmlns:cx6="http://schemas.microsoft.com/office/drawing/2016/5/12/chartex" xmlns:cx7="http://schemas.microsoft.com/office/drawing/2016/5/13/chartex" xmlns:cx8="http://schemas.microsoft.com/office/drawing/2016/5/14/chartex" xmlns:mc="http://schemas.openxmlformats.org/markup-compatibility/2006" xmlns:aink="http://schemas.microsoft.com/office/drawing/2016/ink" xmlns:am3d="http://schemas.microsoft.com/office/drawing/2017/model3d" xmlns:o="urn:schemas-microsoft-com:office:office" xmlns:oel="http://schemas.microsoft.com/office/2019/extlst" xmlns:r="http://schemas.openxmlformats.org/officeDocument/2006/relationships" xmlns:m="http://schemas.openxmlformats.org/officeDocument/2006/math" xmlns:v="urn:schemas-microsoft-com:vml" xmlns:wp14="http://schemas.microsoft.com/office/word/2010/wordprocessingDrawing" xmlns:wp="http://schemas.openxmlformats.org/drawingml/2006/wordprocessingDrawing" xmlns:w10="urn:schemas-microsoft-com:office:word" xmlns:w="http://schemas.openxmlformats.org/wordprocessingml/2006/main" xmlns:w14="http://schemas.microsoft.com/office/word/2010/wordml" xmlns:w15="http://schemas.microsoft.com/office/word/2012/wordml" xmlns:w16cex="http://schemas.microsoft.com/office/word/2018/wordml/cex" xmlns:w16cid="http://schemas.microsoft.com/office/word/2016/wordml/cid" xmlns:w16="http://schemas.microsoft.com/office/word/2018/wordml" xmlns:w16du="http://schemas.microsoft.com/office/word/2023/wordml/word16du" xmlns:w16sdtdh="http://schemas.microsoft.com/office/word/2020/wordml/sdtdatahash" xmlns:w16sdtfl="http://schemas.microsoft.com/office/word/2024/wordml/sdtformatlock" xmlns:w16se="http://schemas.microsoft.com/office/word/2015/wordml/symex" xmlns:wpg="http://schemas.microsoft.com/office/word/2010/wordprocessingGroup" xmlns:wpi="http://schemas.microsoft.com/office/word/2010/wordprocessingInk" xmlns:wne="http://schemas.microsoft.com/office/word/2006/wordml" xmlns:wps="http://schemas.microsoft.com/office/word/2010/wordprocessingShape" mc:Ignorable="w14 w15 w16se w16cid w16 w16cex w16sdtdh w16sdtfl w16du wp14">
+<w:ftr xmlns:wpc="http://schemas.microsoft.com/office/word/2010/wordprocessingCanvas" xmlns:cx="http://schemas.microsoft.com/office/drawing/2014/chartex" xmlns:cx1="http://schemas.microsoft.com/office/drawing/2015/9/8/chartex" xmlns:cx2="http://schemas.microsoft.com/office/drawing/2015/10/21/chartex" xmlns:cx3="http://schemas.microsoft.com/office/drawing/2016/5/9/chartex" xmlns:cx4="http://schemas.microsoft.com/office/drawing/2016/5/10/chartex" xmlns:cx5="http://schemas.microsoft.com/office/drawing/2016/5/11/chartex" xmlns:cx6="http://schemas.microsoft.com/office/drawing/2016/5/12/chartex" xmlns:cx7="http://schemas.microsoft.com/office/drawing/2016/5/13/chartex" xmlns:cx8="http://schemas.microsoft.com/office/drawing/2016/5/14/chartex" xmlns:mc="http://schemas.openxmlformats.org/markup-compatibility/2006" xmlns:aink="http://schemas.microsoft.com/office/drawing/2016/ink" xmlns:am3d="http://schemas.microsoft.com/office/drawing/2017/model3d" xmlns:o="urn:schemas-microsoft-com:office:office" xmlns:oel="http://schemas.microsoft.com/office/2019/extlst" xmlns:r="http://schemas.openxmlformats.org/officeDocument/2006/relationships" xmlns:m="http://schemas.openxmlformats.org/officeDocument/2006/math" xmlns:v="urn:schemas-microsoft-com:vml" xmlns:wp14="http://schemas.microsoft.com/office/word/2010/wordprocessingDrawing" xmlns:wp="http://schemas.openxmlformats.org/drawingml/2006/wordprocessingDrawing" xmlns:w10="urn:schemas-microsoft-com:office:word" xmlns:w="http://schemas.openxmlformats.org/wordprocessingml/2006/main" xmlns:w14="http://schemas.microsoft.com/office/word/2010/wordml" xmlns:w15="http://schemas.microsoft.com/office/word/2012/wordml" xmlns:w16cex="http://schemas.microsoft.com/office/word/2018/wordml/cex" xmlns:w16cid="http://schemas.microsoft.com/office/word/2016/wordml/cid" xmlns:w16="http://schemas.microsoft.com/office/word/2018/wordml" xmlns:w16sdtdh="http://schemas.microsoft.com/office/word/2020/wordml/sdtdatahash" xmlns:w16se="http://schemas.microsoft.com/office/word/2015/wordml/symex" xmlns:wpg="http://schemas.microsoft.com/office/word/2010/wordprocessingGroup" xmlns:wpi="http://schemas.microsoft.com/office/word/2010/wordprocessingInk" xmlns:wne="http://schemas.microsoft.com/office/word/2006/wordml" xmlns:wps="http://schemas.microsoft.com/office/word/2010/wordprocessingShape" mc:Ignorable="w14 w15 w16se w16cid w16 w16cex w16sdtdh wp14">
   <w:tbl>
     <w:tblPr>
       <w:tblW w:w="10065" w:type="dxa"/>
       <w:tblInd w:w="108" w:type="dxa"/>
       <w:tblBorders>
-        <w:top w:val="single" w:color="auto" w:sz="12" w:space="0"/>
+        <w:top w:val="single" w:sz="12" w:space="0" w:color="auto"/>
       </w:tblBorders>
       <w:tblLook w:val="01E0" w:firstRow="1" w:lastRow="1" w:firstColumn="1" w:lastColumn="1" w:noHBand="0" w:noVBand="0"/>
     </w:tblPr>
@@ -4270,7 +4146,6 @@
       <w:tc>
         <w:tcPr>
           <w:tcW w:w="3969" w:type="dxa"/>
-          <w:tcMar/>
           <w:vAlign w:val="center"/>
         </w:tcPr>
         <w:p>
@@ -4320,47 +4195,7 @@
               <w:szCs w:val="16"/>
               <w:lang w:val="de-CH"/>
             </w:rPr>
-            <w:t>E-P_Web2</w:t>
-          </w:r>
-          <w:r>
-            <w:rPr>
-              <w:rFonts w:ascii="Century Gothic" w:hAnsi="Century Gothic"/>
-              <w:noProof/>
-              <w:sz w:val="16"/>
-              <w:szCs w:val="16"/>
-              <w:lang w:val="de-CH"/>
-            </w:rPr>
-            <w:t>95</w:t>
-          </w:r>
-          <w:r>
-            <w:rPr>
-              <w:rFonts w:ascii="Century Gothic" w:hAnsi="Century Gothic"/>
-              <w:noProof/>
-              <w:sz w:val="16"/>
-              <w:szCs w:val="16"/>
-              <w:lang w:val="de-CH"/>
-            </w:rPr>
-            <w:t>-G</w:t>
-          </w:r>
-          <w:r>
-            <w:rPr>
-              <w:rFonts w:ascii="Century Gothic" w:hAnsi="Century Gothic"/>
-              <w:noProof/>
-              <w:sz w:val="16"/>
-              <w:szCs w:val="16"/>
-              <w:lang w:val="de-CH"/>
-            </w:rPr>
-            <w:t>CR</w:t>
-          </w:r>
-          <w:r>
-            <w:rPr>
-              <w:rFonts w:ascii="Century Gothic" w:hAnsi="Century Gothic"/>
-              <w:noProof/>
-              <w:sz w:val="16"/>
-              <w:szCs w:val="16"/>
-              <w:lang w:val="de-CH"/>
-            </w:rPr>
-            <w:t>001-CdC.docx</w:t>
+            <w:t>E-P_Web295-GCR001-CdC.docx</w:t>
           </w:r>
           <w:r>
             <w:rPr>
@@ -4375,7 +4210,6 @@
       <w:tc>
         <w:tcPr>
           <w:tcW w:w="2268" w:type="dxa"/>
-          <w:tcMar/>
           <w:vAlign w:val="center"/>
         </w:tcPr>
         <w:p>
@@ -4396,7 +4230,6 @@
       <w:tc>
         <w:tcPr>
           <w:tcW w:w="3828" w:type="dxa"/>
-          <w:tcMar/>
           <w:vAlign w:val="center"/>
         </w:tcPr>
         <w:p>
@@ -4519,7 +4352,6 @@
       <w:tc>
         <w:tcPr>
           <w:tcW w:w="3969" w:type="dxa"/>
-          <w:tcMar/>
         </w:tcPr>
         <w:p>
           <w:pPr>
@@ -4639,7 +4471,6 @@
       <w:tc>
         <w:tcPr>
           <w:tcW w:w="2268" w:type="dxa"/>
-          <w:tcMar/>
           <w:vAlign w:val="bottom"/>
         </w:tcPr>
         <w:p>
@@ -4770,7 +4601,6 @@
       <w:tc>
         <w:tcPr>
           <w:tcW w:w="3828" w:type="dxa"/>
-          <w:tcMar/>
         </w:tcPr>
         <w:p>
           <w:pPr>
@@ -4931,7 +4761,7 @@
 </file>
 
 <file path=word/footer2.xml><?xml version="1.0" encoding="utf-8"?>
-<w:ftr xmlns:wpc="http://schemas.microsoft.com/office/word/2010/wordprocessingCanvas" xmlns:cx="http://schemas.microsoft.com/office/drawing/2014/chartex" xmlns:cx1="http://schemas.microsoft.com/office/drawing/2015/9/8/chartex" xmlns:cx2="http://schemas.microsoft.com/office/drawing/2015/10/21/chartex" xmlns:cx3="http://schemas.microsoft.com/office/drawing/2016/5/9/chartex" xmlns:cx4="http://schemas.microsoft.com/office/drawing/2016/5/10/chartex" xmlns:cx5="http://schemas.microsoft.com/office/drawing/2016/5/11/chartex" xmlns:cx6="http://schemas.microsoft.com/office/drawing/2016/5/12/chartex" xmlns:cx7="http://schemas.microsoft.com/office/drawing/2016/5/13/chartex" xmlns:cx8="http://schemas.microsoft.com/office/drawing/2016/5/14/chartex" xmlns:mc="http://schemas.openxmlformats.org/markup-compatibility/2006" xmlns:aink="http://schemas.microsoft.com/office/drawing/2016/ink" xmlns:am3d="http://schemas.microsoft.com/office/drawing/2017/model3d" xmlns:o="urn:schemas-microsoft-com:office:office" xmlns:oel="http://schemas.microsoft.com/office/2019/extlst" xmlns:r="http://schemas.openxmlformats.org/officeDocument/2006/relationships" xmlns:m="http://schemas.openxmlformats.org/officeDocument/2006/math" xmlns:v="urn:schemas-microsoft-com:vml" xmlns:wp14="http://schemas.microsoft.com/office/word/2010/wordprocessingDrawing" xmlns:wp="http://schemas.openxmlformats.org/drawingml/2006/wordprocessingDrawing" xmlns:w10="urn:schemas-microsoft-com:office:word" xmlns:w="http://schemas.openxmlformats.org/wordprocessingml/2006/main" xmlns:w14="http://schemas.microsoft.com/office/word/2010/wordml" xmlns:w15="http://schemas.microsoft.com/office/word/2012/wordml" xmlns:w16cex="http://schemas.microsoft.com/office/word/2018/wordml/cex" xmlns:w16cid="http://schemas.microsoft.com/office/word/2016/wordml/cid" xmlns:w16="http://schemas.microsoft.com/office/word/2018/wordml" xmlns:w16du="http://schemas.microsoft.com/office/word/2023/wordml/word16du" xmlns:w16sdtdh="http://schemas.microsoft.com/office/word/2020/wordml/sdtdatahash" xmlns:w16sdtfl="http://schemas.microsoft.com/office/word/2024/wordml/sdtformatlock" xmlns:w16se="http://schemas.microsoft.com/office/word/2015/wordml/symex" xmlns:wpg="http://schemas.microsoft.com/office/word/2010/wordprocessingGroup" xmlns:wpi="http://schemas.microsoft.com/office/word/2010/wordprocessingInk" xmlns:wne="http://schemas.microsoft.com/office/word/2006/wordml" xmlns:wps="http://schemas.microsoft.com/office/word/2010/wordprocessingShape" xmlns:a="http://schemas.openxmlformats.org/drawingml/2006/main" xmlns:a14="http://schemas.microsoft.com/office/drawing/2010/main" mc:Ignorable="w14 w15 w16se w16cid w16 w16cex w16sdtdh w16sdtfl w16du wp14">
+<w:ftr xmlns:wpc="http://schemas.microsoft.com/office/word/2010/wordprocessingCanvas" xmlns:cx="http://schemas.microsoft.com/office/drawing/2014/chartex" xmlns:cx1="http://schemas.microsoft.com/office/drawing/2015/9/8/chartex" xmlns:cx2="http://schemas.microsoft.com/office/drawing/2015/10/21/chartex" xmlns:cx3="http://schemas.microsoft.com/office/drawing/2016/5/9/chartex" xmlns:cx4="http://schemas.microsoft.com/office/drawing/2016/5/10/chartex" xmlns:cx5="http://schemas.microsoft.com/office/drawing/2016/5/11/chartex" xmlns:cx6="http://schemas.microsoft.com/office/drawing/2016/5/12/chartex" xmlns:cx7="http://schemas.microsoft.com/office/drawing/2016/5/13/chartex" xmlns:cx8="http://schemas.microsoft.com/office/drawing/2016/5/14/chartex" xmlns:mc="http://schemas.openxmlformats.org/markup-compatibility/2006" xmlns:aink="http://schemas.microsoft.com/office/drawing/2016/ink" xmlns:am3d="http://schemas.microsoft.com/office/drawing/2017/model3d" xmlns:o="urn:schemas-microsoft-com:office:office" xmlns:oel="http://schemas.microsoft.com/office/2019/extlst" xmlns:r="http://schemas.openxmlformats.org/officeDocument/2006/relationships" xmlns:m="http://schemas.openxmlformats.org/officeDocument/2006/math" xmlns:v="urn:schemas-microsoft-com:vml" xmlns:wp14="http://schemas.microsoft.com/office/word/2010/wordprocessingDrawing" xmlns:wp="http://schemas.openxmlformats.org/drawingml/2006/wordprocessingDrawing" xmlns:w10="urn:schemas-microsoft-com:office:word" xmlns:w="http://schemas.openxmlformats.org/wordprocessingml/2006/main" xmlns:w14="http://schemas.microsoft.com/office/word/2010/wordml" xmlns:w15="http://schemas.microsoft.com/office/word/2012/wordml" xmlns:w16cex="http://schemas.microsoft.com/office/word/2018/wordml/cex" xmlns:w16cid="http://schemas.microsoft.com/office/word/2016/wordml/cid" xmlns:w16="http://schemas.microsoft.com/office/word/2018/wordml" xmlns:w16sdtdh="http://schemas.microsoft.com/office/word/2020/wordml/sdtdatahash" xmlns:w16se="http://schemas.microsoft.com/office/word/2015/wordml/symex" xmlns:wpg="http://schemas.microsoft.com/office/word/2010/wordprocessingGroup" xmlns:wpi="http://schemas.microsoft.com/office/word/2010/wordprocessingInk" xmlns:wne="http://schemas.microsoft.com/office/word/2006/wordml" xmlns:wps="http://schemas.microsoft.com/office/word/2010/wordprocessingShape" mc:Ignorable="w14 w15 w16se w16cid w16 w16cex w16sdtdh wp14">
   <w:p>
     <w:pPr>
       <w:pStyle w:val="Pieddepage"/>
@@ -5011,8 +4841,8 @@
           </w:drawing>
         </mc:Choice>
         <mc:Fallback>
-          <w:pict w14:anchorId="524A1651">
-            <v:line id="Line 2" style="position:absolute;z-index:251658240;visibility:visible;mso-wrap-style:square;mso-width-percent:0;mso-height-percent:0;mso-wrap-distance-left:9pt;mso-wrap-distance-top:0;mso-wrap-distance-right:9pt;mso-wrap-distance-bottom:0;mso-position-horizontal:absolute;mso-position-horizontal-relative:text;mso-position-vertical:absolute;mso-position-vertical-relative:text;mso-width-percent:0;mso-height-percent:0;mso-width-relative:page;mso-height-relative:page" o:spid="_x0000_s1026" from="-.5pt,-.1pt" to="496.35pt,-.1pt" w14:anchorId="2A2412BF" o:gfxdata="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"/>
+          <w:pict>
+            <v:line w14:anchorId="7799E44D" id="Line 2" o:spid="_x0000_s1026" style="position:absolute;z-index:251658240;visibility:visible;mso-wrap-style:square;mso-width-percent:0;mso-height-percent:0;mso-wrap-distance-left:9pt;mso-wrap-distance-top:0;mso-wrap-distance-right:9pt;mso-wrap-distance-bottom:0;mso-position-horizontal:absolute;mso-position-horizontal-relative:text;mso-position-vertical:absolute;mso-position-vertical-relative:text;mso-width-percent:0;mso-height-percent:0;mso-width-relative:page;mso-height-relative:page" from="-.5pt,-.1pt" to="496.35pt,-.1pt" o:gfxdata="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"/>
           </w:pict>
         </mc:Fallback>
       </mc:AlternateContent>
@@ -5087,13 +4917,6 @@
         <w:sz w:val="12"/>
       </w:rPr>
       <w:tab/>
-    </w:r>
-    <w:r>
-      <w:rPr>
-        <w:rFonts w:cs="Arial"/>
-        <w:snapToGrid w:val="0"/>
-        <w:sz w:val="12"/>
-      </w:rPr>
       <w:t>Version du 1.08.03</w:t>
     </w:r>
   </w:p>
@@ -5155,13 +4978,6 @@
         <w:sz w:val="12"/>
       </w:rPr>
       <w:tab/>
-    </w:r>
-    <w:r>
-      <w:rPr>
-        <w:rFonts w:cs="Arial"/>
-        <w:snapToGrid w:val="0"/>
-        <w:sz w:val="12"/>
-      </w:rPr>
       <w:t xml:space="preserve">Imprimé le </w:t>
     </w:r>
     <w:r>
@@ -5195,7 +5011,7 @@
         <w:snapToGrid w:val="0"/>
         <w:sz w:val="12"/>
       </w:rPr>
-      <w:t>04/02/2026</w:t>
+      <w:t>04/03/2026</w:t>
     </w:r>
     <w:r>
       <w:rPr>
@@ -5244,7 +5060,7 @@
         <w:snapToGrid w:val="0"/>
         <w:sz w:val="12"/>
       </w:rPr>
-      <w:t>10:05</w:t>
+      <w:t>10:41</w:t>
     </w:r>
     <w:r>
       <w:rPr>
@@ -5386,7 +5202,7 @@
 </file>
 
 <file path=word/footnotes.xml><?xml version="1.0" encoding="utf-8"?>
-<w:footnotes xmlns:wpc="http://schemas.microsoft.com/office/word/2010/wordprocessingCanvas" xmlns:cx="http://schemas.microsoft.com/office/drawing/2014/chartex" xmlns:cx1="http://schemas.microsoft.com/office/drawing/2015/9/8/chartex" xmlns:cx2="http://schemas.microsoft.com/office/drawing/2015/10/21/chartex" xmlns:cx3="http://schemas.microsoft.com/office/drawing/2016/5/9/chartex" xmlns:cx4="http://schemas.microsoft.com/office/drawing/2016/5/10/chartex" xmlns:cx5="http://schemas.microsoft.com/office/drawing/2016/5/11/chartex" xmlns:cx6="http://schemas.microsoft.com/office/drawing/2016/5/12/chartex" xmlns:cx7="http://schemas.microsoft.com/office/drawing/2016/5/13/chartex" xmlns:cx8="http://schemas.microsoft.com/office/drawing/2016/5/14/chartex" xmlns:mc="http://schemas.openxmlformats.org/markup-compatibility/2006" xmlns:aink="http://schemas.microsoft.com/office/drawing/2016/ink" xmlns:am3d="http://schemas.microsoft.com/office/drawing/2017/model3d" xmlns:o="urn:schemas-microsoft-com:office:office" xmlns:oel="http://schemas.microsoft.com/office/2019/extlst" xmlns:r="http://schemas.openxmlformats.org/officeDocument/2006/relationships" xmlns:m="http://schemas.openxmlformats.org/officeDocument/2006/math" xmlns:v="urn:schemas-microsoft-com:vml" xmlns:wp14="http://schemas.microsoft.com/office/word/2010/wordprocessingDrawing" xmlns:wp="http://schemas.openxmlformats.org/drawingml/2006/wordprocessingDrawing" xmlns:w10="urn:schemas-microsoft-com:office:word" xmlns:w="http://schemas.openxmlformats.org/wordprocessingml/2006/main" xmlns:w14="http://schemas.microsoft.com/office/word/2010/wordml" xmlns:w15="http://schemas.microsoft.com/office/word/2012/wordml" xmlns:w16cex="http://schemas.microsoft.com/office/word/2018/wordml/cex" xmlns:w16cid="http://schemas.microsoft.com/office/word/2016/wordml/cid" xmlns:w16="http://schemas.microsoft.com/office/word/2018/wordml" xmlns:w16du="http://schemas.microsoft.com/office/word/2023/wordml/word16du" xmlns:w16sdtdh="http://schemas.microsoft.com/office/word/2020/wordml/sdtdatahash" xmlns:w16sdtfl="http://schemas.microsoft.com/office/word/2024/wordml/sdtformatlock" xmlns:w16se="http://schemas.microsoft.com/office/word/2015/wordml/symex" xmlns:wpg="http://schemas.microsoft.com/office/word/2010/wordprocessingGroup" xmlns:wpi="http://schemas.microsoft.com/office/word/2010/wordprocessingInk" xmlns:wne="http://schemas.microsoft.com/office/word/2006/wordml" xmlns:wps="http://schemas.microsoft.com/office/word/2010/wordprocessingShape" mc:Ignorable="w14 w15 w16se w16cid w16 w16cex w16sdtdh w16sdtfl w16du wp14">
+<w:footnotes xmlns:wpc="http://schemas.microsoft.com/office/word/2010/wordprocessingCanvas" xmlns:cx="http://schemas.microsoft.com/office/drawing/2014/chartex" xmlns:cx1="http://schemas.microsoft.com/office/drawing/2015/9/8/chartex" xmlns:cx2="http://schemas.microsoft.com/office/drawing/2015/10/21/chartex" xmlns:cx3="http://schemas.microsoft.com/office/drawing/2016/5/9/chartex" xmlns:cx4="http://schemas.microsoft.com/office/drawing/2016/5/10/chartex" xmlns:cx5="http://schemas.microsoft.com/office/drawing/2016/5/11/chartex" xmlns:cx6="http://schemas.microsoft.com/office/drawing/2016/5/12/chartex" xmlns:cx7="http://schemas.microsoft.com/office/drawing/2016/5/13/chartex" xmlns:cx8="http://schemas.microsoft.com/office/drawing/2016/5/14/chartex" xmlns:mc="http://schemas.openxmlformats.org/markup-compatibility/2006" xmlns:aink="http://schemas.microsoft.com/office/drawing/2016/ink" xmlns:am3d="http://schemas.microsoft.com/office/drawing/2017/model3d" xmlns:o="urn:schemas-microsoft-com:office:office" xmlns:oel="http://schemas.microsoft.com/office/2019/extlst" xmlns:r="http://schemas.openxmlformats.org/officeDocument/2006/relationships" xmlns:m="http://schemas.openxmlformats.org/officeDocument/2006/math" xmlns:v="urn:schemas-microsoft-com:vml" xmlns:wp14="http://schemas.microsoft.com/office/word/2010/wordprocessingDrawing" xmlns:wp="http://schemas.openxmlformats.org/drawingml/2006/wordprocessingDrawing" xmlns:w10="urn:schemas-microsoft-com:office:word" xmlns:w="http://schemas.openxmlformats.org/wordprocessingml/2006/main" xmlns:w14="http://schemas.microsoft.com/office/word/2010/wordml" xmlns:w15="http://schemas.microsoft.com/office/word/2012/wordml" xmlns:w16cex="http://schemas.microsoft.com/office/word/2018/wordml/cex" xmlns:w16cid="http://schemas.microsoft.com/office/word/2016/wordml/cid" xmlns:w16="http://schemas.microsoft.com/office/word/2018/wordml" xmlns:w16sdtdh="http://schemas.microsoft.com/office/word/2020/wordml/sdtdatahash" xmlns:w16se="http://schemas.microsoft.com/office/word/2015/wordml/symex" xmlns:wpg="http://schemas.microsoft.com/office/word/2010/wordprocessingGroup" xmlns:wpi="http://schemas.microsoft.com/office/word/2010/wordprocessingInk" xmlns:wne="http://schemas.microsoft.com/office/word/2006/wordml" xmlns:wps="http://schemas.microsoft.com/office/word/2010/wordprocessingShape" mc:Ignorable="w14 w15 w16se w16cid w16 w16cex w16sdtdh wp14">
   <w:footnote w:type="separator" w:id="-1">
     <w:p>
       <w:r>
@@ -5467,13 +5283,13 @@
 </file>
 
 <file path=word/header1.xml><?xml version="1.0" encoding="utf-8"?>
-<w:hdr xmlns:wpc="http://schemas.microsoft.com/office/word/2010/wordprocessingCanvas" xmlns:cx="http://schemas.microsoft.com/office/drawing/2014/chartex" xmlns:cx1="http://schemas.microsoft.com/office/drawing/2015/9/8/chartex" xmlns:cx2="http://schemas.microsoft.com/office/drawing/2015/10/21/chartex" xmlns:cx3="http://schemas.microsoft.com/office/drawing/2016/5/9/chartex" xmlns:cx4="http://schemas.microsoft.com/office/drawing/2016/5/10/chartex" xmlns:cx5="http://schemas.microsoft.com/office/drawing/2016/5/11/chartex" xmlns:cx6="http://schemas.microsoft.com/office/drawing/2016/5/12/chartex" xmlns:cx7="http://schemas.microsoft.com/office/drawing/2016/5/13/chartex" xmlns:cx8="http://schemas.microsoft.com/office/drawing/2016/5/14/chartex" xmlns:mc="http://schemas.openxmlformats.org/markup-compatibility/2006" xmlns:aink="http://schemas.microsoft.com/office/drawing/2016/ink" xmlns:am3d="http://schemas.microsoft.com/office/drawing/2017/model3d" xmlns:o="urn:schemas-microsoft-com:office:office" xmlns:oel="http://schemas.microsoft.com/office/2019/extlst" xmlns:r="http://schemas.openxmlformats.org/officeDocument/2006/relationships" xmlns:m="http://schemas.openxmlformats.org/officeDocument/2006/math" xmlns:v="urn:schemas-microsoft-com:vml" xmlns:wp14="http://schemas.microsoft.com/office/word/2010/wordprocessingDrawing" xmlns:wp="http://schemas.openxmlformats.org/drawingml/2006/wordprocessingDrawing" xmlns:w10="urn:schemas-microsoft-com:office:word" xmlns:w="http://schemas.openxmlformats.org/wordprocessingml/2006/main" xmlns:w14="http://schemas.microsoft.com/office/word/2010/wordml" xmlns:w15="http://schemas.microsoft.com/office/word/2012/wordml" xmlns:w16cex="http://schemas.microsoft.com/office/word/2018/wordml/cex" xmlns:w16cid="http://schemas.microsoft.com/office/word/2016/wordml/cid" xmlns:w16="http://schemas.microsoft.com/office/word/2018/wordml" xmlns:w16du="http://schemas.microsoft.com/office/word/2023/wordml/word16du" xmlns:w16sdtdh="http://schemas.microsoft.com/office/word/2020/wordml/sdtdatahash" xmlns:w16sdtfl="http://schemas.microsoft.com/office/word/2024/wordml/sdtformatlock" xmlns:w16se="http://schemas.microsoft.com/office/word/2015/wordml/symex" xmlns:wpg="http://schemas.microsoft.com/office/word/2010/wordprocessingGroup" xmlns:wpi="http://schemas.microsoft.com/office/word/2010/wordprocessingInk" xmlns:wne="http://schemas.microsoft.com/office/word/2006/wordml" xmlns:wps="http://schemas.microsoft.com/office/word/2010/wordprocessingShape" xmlns:a="http://schemas.openxmlformats.org/drawingml/2006/main" xmlns:pic="http://schemas.openxmlformats.org/drawingml/2006/picture" xmlns:a14="http://schemas.microsoft.com/office/drawing/2010/main" mc:Ignorable="w14 w15 w16se w16cid w16 w16cex w16sdtdh w16sdtfl w16du wp14">
+<w:hdr xmlns:wpc="http://schemas.microsoft.com/office/word/2010/wordprocessingCanvas" xmlns:cx="http://schemas.microsoft.com/office/drawing/2014/chartex" xmlns:cx1="http://schemas.microsoft.com/office/drawing/2015/9/8/chartex" xmlns:cx2="http://schemas.microsoft.com/office/drawing/2015/10/21/chartex" xmlns:cx3="http://schemas.microsoft.com/office/drawing/2016/5/9/chartex" xmlns:cx4="http://schemas.microsoft.com/office/drawing/2016/5/10/chartex" xmlns:cx5="http://schemas.microsoft.com/office/drawing/2016/5/11/chartex" xmlns:cx6="http://schemas.microsoft.com/office/drawing/2016/5/12/chartex" xmlns:cx7="http://schemas.microsoft.com/office/drawing/2016/5/13/chartex" xmlns:cx8="http://schemas.microsoft.com/office/drawing/2016/5/14/chartex" xmlns:mc="http://schemas.openxmlformats.org/markup-compatibility/2006" xmlns:aink="http://schemas.microsoft.com/office/drawing/2016/ink" xmlns:am3d="http://schemas.microsoft.com/office/drawing/2017/model3d" xmlns:o="urn:schemas-microsoft-com:office:office" xmlns:oel="http://schemas.microsoft.com/office/2019/extlst" xmlns:r="http://schemas.openxmlformats.org/officeDocument/2006/relationships" xmlns:m="http://schemas.openxmlformats.org/officeDocument/2006/math" xmlns:v="urn:schemas-microsoft-com:vml" xmlns:wp14="http://schemas.microsoft.com/office/word/2010/wordprocessingDrawing" xmlns:wp="http://schemas.openxmlformats.org/drawingml/2006/wordprocessingDrawing" xmlns:w10="urn:schemas-microsoft-com:office:word" xmlns:w="http://schemas.openxmlformats.org/wordprocessingml/2006/main" xmlns:w14="http://schemas.microsoft.com/office/word/2010/wordml" xmlns:w15="http://schemas.microsoft.com/office/word/2012/wordml" xmlns:w16cex="http://schemas.microsoft.com/office/word/2018/wordml/cex" xmlns:w16cid="http://schemas.microsoft.com/office/word/2016/wordml/cid" xmlns:w16="http://schemas.microsoft.com/office/word/2018/wordml" xmlns:w16sdtdh="http://schemas.microsoft.com/office/word/2020/wordml/sdtdatahash" xmlns:w16se="http://schemas.microsoft.com/office/word/2015/wordml/symex" xmlns:wpg="http://schemas.microsoft.com/office/word/2010/wordprocessingGroup" xmlns:wpi="http://schemas.microsoft.com/office/word/2010/wordprocessingInk" xmlns:wne="http://schemas.microsoft.com/office/word/2006/wordml" xmlns:wps="http://schemas.microsoft.com/office/word/2010/wordprocessingShape" mc:Ignorable="w14 w15 w16se w16cid w16 w16cex w16sdtdh wp14">
   <w:tbl>
     <w:tblPr>
       <w:tblW w:w="10084" w:type="dxa"/>
       <w:jc w:val="center"/>
       <w:tblBorders>
-        <w:bottom w:val="single" w:color="auto" w:sz="12" w:space="0"/>
+        <w:bottom w:val="single" w:sz="12" w:space="0" w:color="auto"/>
       </w:tblBorders>
       <w:tblLayout w:type="fixed"/>
       <w:tblCellMar>
@@ -5637,14 +5453,14 @@
 </file>
 
 <file path=word/header2.xml><?xml version="1.0" encoding="utf-8"?>
-<w:hdr xmlns:wpc="http://schemas.microsoft.com/office/word/2010/wordprocessingCanvas" xmlns:cx="http://schemas.microsoft.com/office/drawing/2014/chartex" xmlns:cx1="http://schemas.microsoft.com/office/drawing/2015/9/8/chartex" xmlns:cx2="http://schemas.microsoft.com/office/drawing/2015/10/21/chartex" xmlns:cx3="http://schemas.microsoft.com/office/drawing/2016/5/9/chartex" xmlns:cx4="http://schemas.microsoft.com/office/drawing/2016/5/10/chartex" xmlns:cx5="http://schemas.microsoft.com/office/drawing/2016/5/11/chartex" xmlns:cx6="http://schemas.microsoft.com/office/drawing/2016/5/12/chartex" xmlns:cx7="http://schemas.microsoft.com/office/drawing/2016/5/13/chartex" xmlns:cx8="http://schemas.microsoft.com/office/drawing/2016/5/14/chartex" xmlns:mc="http://schemas.openxmlformats.org/markup-compatibility/2006" xmlns:aink="http://schemas.microsoft.com/office/drawing/2016/ink" xmlns:am3d="http://schemas.microsoft.com/office/drawing/2017/model3d" xmlns:o="urn:schemas-microsoft-com:office:office" xmlns:oel="http://schemas.microsoft.com/office/2019/extlst" xmlns:r="http://schemas.openxmlformats.org/officeDocument/2006/relationships" xmlns:m="http://schemas.openxmlformats.org/officeDocument/2006/math" xmlns:v="urn:schemas-microsoft-com:vml" xmlns:wp14="http://schemas.microsoft.com/office/word/2010/wordprocessingDrawing" xmlns:wp="http://schemas.openxmlformats.org/drawingml/2006/wordprocessingDrawing" xmlns:w10="urn:schemas-microsoft-com:office:word" xmlns:w="http://schemas.openxmlformats.org/wordprocessingml/2006/main" xmlns:w14="http://schemas.microsoft.com/office/word/2010/wordml" xmlns:w15="http://schemas.microsoft.com/office/word/2012/wordml" xmlns:w16cex="http://schemas.microsoft.com/office/word/2018/wordml/cex" xmlns:w16cid="http://schemas.microsoft.com/office/word/2016/wordml/cid" xmlns:w16="http://schemas.microsoft.com/office/word/2018/wordml" xmlns:w16du="http://schemas.microsoft.com/office/word/2023/wordml/word16du" xmlns:w16sdtdh="http://schemas.microsoft.com/office/word/2020/wordml/sdtdatahash" xmlns:w16sdtfl="http://schemas.microsoft.com/office/word/2024/wordml/sdtformatlock" xmlns:w16se="http://schemas.microsoft.com/office/word/2015/wordml/symex" xmlns:wpg="http://schemas.microsoft.com/office/word/2010/wordprocessingGroup" xmlns:wpi="http://schemas.microsoft.com/office/word/2010/wordprocessingInk" xmlns:wne="http://schemas.microsoft.com/office/word/2006/wordml" xmlns:wps="http://schemas.microsoft.com/office/word/2010/wordprocessingShape" mc:Ignorable="w14 w15 w16se w16cid w16 w16cex w16sdtdh w16sdtfl w16du wp14">
+<w:hdr xmlns:wpc="http://schemas.microsoft.com/office/word/2010/wordprocessingCanvas" xmlns:cx="http://schemas.microsoft.com/office/drawing/2014/chartex" xmlns:cx1="http://schemas.microsoft.com/office/drawing/2015/9/8/chartex" xmlns:cx2="http://schemas.microsoft.com/office/drawing/2015/10/21/chartex" xmlns:cx3="http://schemas.microsoft.com/office/drawing/2016/5/9/chartex" xmlns:cx4="http://schemas.microsoft.com/office/drawing/2016/5/10/chartex" xmlns:cx5="http://schemas.microsoft.com/office/drawing/2016/5/11/chartex" xmlns:cx6="http://schemas.microsoft.com/office/drawing/2016/5/12/chartex" xmlns:cx7="http://schemas.microsoft.com/office/drawing/2016/5/13/chartex" xmlns:cx8="http://schemas.microsoft.com/office/drawing/2016/5/14/chartex" xmlns:mc="http://schemas.openxmlformats.org/markup-compatibility/2006" xmlns:aink="http://schemas.microsoft.com/office/drawing/2016/ink" xmlns:am3d="http://schemas.microsoft.com/office/drawing/2017/model3d" xmlns:o="urn:schemas-microsoft-com:office:office" xmlns:oel="http://schemas.microsoft.com/office/2019/extlst" xmlns:r="http://schemas.openxmlformats.org/officeDocument/2006/relationships" xmlns:m="http://schemas.openxmlformats.org/officeDocument/2006/math" xmlns:v="urn:schemas-microsoft-com:vml" xmlns:wp14="http://schemas.microsoft.com/office/word/2010/wordprocessingDrawing" xmlns:wp="http://schemas.openxmlformats.org/drawingml/2006/wordprocessingDrawing" xmlns:w10="urn:schemas-microsoft-com:office:word" xmlns:w="http://schemas.openxmlformats.org/wordprocessingml/2006/main" xmlns:w14="http://schemas.microsoft.com/office/word/2010/wordml" xmlns:w15="http://schemas.microsoft.com/office/word/2012/wordml" xmlns:w16cex="http://schemas.microsoft.com/office/word/2018/wordml/cex" xmlns:w16cid="http://schemas.microsoft.com/office/word/2016/wordml/cid" xmlns:w16="http://schemas.microsoft.com/office/word/2018/wordml" xmlns:w16sdtdh="http://schemas.microsoft.com/office/word/2020/wordml/sdtdatahash" xmlns:w16se="http://schemas.microsoft.com/office/word/2015/wordml/symex" xmlns:wpg="http://schemas.microsoft.com/office/word/2010/wordprocessingGroup" xmlns:wpi="http://schemas.microsoft.com/office/word/2010/wordprocessingInk" xmlns:wne="http://schemas.microsoft.com/office/word/2006/wordml" xmlns:wps="http://schemas.microsoft.com/office/word/2010/wordprocessingShape" mc:Ignorable="w14 w15 w16se w16cid w16 w16cex w16sdtdh wp14">
   <w:tbl>
     <w:tblPr>
       <w:tblW w:w="9754" w:type="dxa"/>
       <w:tblInd w:w="97" w:type="dxa"/>
       <w:tblBorders>
-        <w:bottom w:val="single" w:color="auto" w:sz="12" w:space="0"/>
-        <w:insideH w:val="single" w:color="auto" w:sz="4" w:space="0"/>
+        <w:bottom w:val="single" w:sz="12" w:space="0" w:color="auto"/>
+        <w:insideH w:val="single" w:sz="4" w:space="0" w:color="auto"/>
       </w:tblBorders>
       <w:tblLayout w:type="fixed"/>
       <w:tblCellMar>
@@ -5702,7 +5518,7 @@
           <w:tcW w:w="2410" w:type="dxa"/>
           <w:tcBorders>
             <w:top w:val="nil"/>
-            <w:bottom w:val="single" w:color="auto" w:sz="12" w:space="0"/>
+            <w:bottom w:val="single" w:sz="12" w:space="0" w:color="auto"/>
             <w:right w:val="nil"/>
           </w:tcBorders>
           <w:vAlign w:val="center"/>
@@ -5748,13 +5564,8 @@
             <w:jc w:val="right"/>
           </w:pPr>
           <w:r>
-            <w:t xml:space="preserve">Projet : </w:t>
+            <w:t>Projet : xxxxxx</w:t>
           </w:r>
-          <w:proofErr w:type="spellStart"/>
-          <w:r>
-            <w:t>xxxxxx</w:t>
-          </w:r>
-          <w:proofErr w:type="spellEnd"/>
         </w:p>
       </w:tc>
     </w:tr>
@@ -5771,7 +5582,7 @@
 </file>
 
 <file path=word/numbering.xml><?xml version="1.0" encoding="utf-8"?>
-<w:numbering xmlns:wpc="http://schemas.microsoft.com/office/word/2010/wordprocessingCanvas" xmlns:cx="http://schemas.microsoft.com/office/drawing/2014/chartex" xmlns:cx1="http://schemas.microsoft.com/office/drawing/2015/9/8/chartex" xmlns:cx2="http://schemas.microsoft.com/office/drawing/2015/10/21/chartex" xmlns:cx3="http://schemas.microsoft.com/office/drawing/2016/5/9/chartex" xmlns:cx4="http://schemas.microsoft.com/office/drawing/2016/5/10/chartex" xmlns:cx5="http://schemas.microsoft.com/office/drawing/2016/5/11/chartex" xmlns:cx6="http://schemas.microsoft.com/office/drawing/2016/5/12/chartex" xmlns:cx7="http://schemas.microsoft.com/office/drawing/2016/5/13/chartex" xmlns:cx8="http://schemas.microsoft.com/office/drawing/2016/5/14/chartex" xmlns:mc="http://schemas.openxmlformats.org/markup-compatibility/2006" xmlns:aink="http://schemas.microsoft.com/office/drawing/2016/ink" xmlns:am3d="http://schemas.microsoft.com/office/drawing/2017/model3d" xmlns:o="urn:schemas-microsoft-com:office:office" xmlns:oel="http://schemas.microsoft.com/office/2019/extlst" xmlns:r="http://schemas.openxmlformats.org/officeDocument/2006/relationships" xmlns:m="http://schemas.openxmlformats.org/officeDocument/2006/math" xmlns:v="urn:schemas-microsoft-com:vml" xmlns:wp14="http://schemas.microsoft.com/office/word/2010/wordprocessingDrawing" xmlns:wp="http://schemas.openxmlformats.org/drawingml/2006/wordprocessingDrawing" xmlns:w10="urn:schemas-microsoft-com:office:word" xmlns:w="http://schemas.openxmlformats.org/wordprocessingml/2006/main" xmlns:w14="http://schemas.microsoft.com/office/word/2010/wordml" xmlns:w15="http://schemas.microsoft.com/office/word/2012/wordml" xmlns:w16cex="http://schemas.microsoft.com/office/word/2018/wordml/cex" xmlns:w16cid="http://schemas.microsoft.com/office/word/2016/wordml/cid" xmlns:w16="http://schemas.microsoft.com/office/word/2018/wordml" xmlns:w16du="http://schemas.microsoft.com/office/word/2023/wordml/word16du" xmlns:w16sdtdh="http://schemas.microsoft.com/office/word/2020/wordml/sdtdatahash" xmlns:w16sdtfl="http://schemas.microsoft.com/office/word/2024/wordml/sdtformatlock" xmlns:w16se="http://schemas.microsoft.com/office/word/2015/wordml/symex" xmlns:wpg="http://schemas.microsoft.com/office/word/2010/wordprocessingGroup" xmlns:wpi="http://schemas.microsoft.com/office/word/2010/wordprocessingInk" xmlns:wne="http://schemas.microsoft.com/office/word/2006/wordml" xmlns:wps="http://schemas.microsoft.com/office/word/2010/wordprocessingShape" mc:Ignorable="w14 w15 w16se w16cid w16 w16cex w16sdtdh w16sdtfl w16du wp14">
+<w:numbering xmlns:wpc="http://schemas.microsoft.com/office/word/2010/wordprocessingCanvas" xmlns:cx="http://schemas.microsoft.com/office/drawing/2014/chartex" xmlns:cx1="http://schemas.microsoft.com/office/drawing/2015/9/8/chartex" xmlns:cx2="http://schemas.microsoft.com/office/drawing/2015/10/21/chartex" xmlns:cx3="http://schemas.microsoft.com/office/drawing/2016/5/9/chartex" xmlns:cx4="http://schemas.microsoft.com/office/drawing/2016/5/10/chartex" xmlns:cx5="http://schemas.microsoft.com/office/drawing/2016/5/11/chartex" xmlns:cx6="http://schemas.microsoft.com/office/drawing/2016/5/12/chartex" xmlns:cx7="http://schemas.microsoft.com/office/drawing/2016/5/13/chartex" xmlns:cx8="http://schemas.microsoft.com/office/drawing/2016/5/14/chartex" xmlns:mc="http://schemas.openxmlformats.org/markup-compatibility/2006" xmlns:aink="http://schemas.microsoft.com/office/drawing/2016/ink" xmlns:am3d="http://schemas.microsoft.com/office/drawing/2017/model3d" xmlns:o="urn:schemas-microsoft-com:office:office" xmlns:oel="http://schemas.microsoft.com/office/2019/extlst" xmlns:r="http://schemas.openxmlformats.org/officeDocument/2006/relationships" xmlns:m="http://schemas.openxmlformats.org/officeDocument/2006/math" xmlns:v="urn:schemas-microsoft-com:vml" xmlns:wp14="http://schemas.microsoft.com/office/word/2010/wordprocessingDrawing" xmlns:wp="http://schemas.openxmlformats.org/drawingml/2006/wordprocessingDrawing" xmlns:w10="urn:schemas-microsoft-com:office:word" xmlns:w="http://schemas.openxmlformats.org/wordprocessingml/2006/main" xmlns:w14="http://schemas.microsoft.com/office/word/2010/wordml" xmlns:w15="http://schemas.microsoft.com/office/word/2012/wordml" xmlns:w16cex="http://schemas.microsoft.com/office/word/2018/wordml/cex" xmlns:w16cid="http://schemas.microsoft.com/office/word/2016/wordml/cid" xmlns:w16="http://schemas.microsoft.com/office/word/2018/wordml" xmlns:w16sdtdh="http://schemas.microsoft.com/office/word/2020/wordml/sdtdatahash" xmlns:w16se="http://schemas.microsoft.com/office/word/2015/wordml/symex" xmlns:wpg="http://schemas.microsoft.com/office/word/2010/wordprocessingGroup" xmlns:wpi="http://schemas.microsoft.com/office/word/2010/wordprocessingInk" xmlns:wne="http://schemas.microsoft.com/office/word/2006/wordml" xmlns:wps="http://schemas.microsoft.com/office/word/2010/wordprocessingShape" mc:Ignorable="w14 w15 w16se w16cid w16 w16cex w16sdtdh wp14">
   <w:abstractNum w:abstractNumId="0" w15:restartNumberingAfterBreak="0">
     <w:nsid w:val="00D0490F"/>
     <w:multiLevelType w:val="hybridMultilevel"/>
@@ -5785,7 +5596,7 @@
         <w:ind w:left="1713" w:hanging="360"/>
       </w:pPr>
       <w:rPr>
-        <w:rFonts w:hint="default" w:ascii="Symbol" w:hAnsi="Symbol"/>
+        <w:rFonts w:ascii="Symbol" w:hAnsi="Symbol" w:hint="default"/>
       </w:rPr>
     </w:lvl>
     <w:lvl w:ilvl="1" w:tplc="100C0003">
@@ -5797,7 +5608,7 @@
         <w:ind w:left="2433" w:hanging="360"/>
       </w:pPr>
       <w:rPr>
-        <w:rFonts w:hint="default" w:ascii="Courier New" w:hAnsi="Courier New" w:cs="Courier New"/>
+        <w:rFonts w:ascii="Courier New" w:hAnsi="Courier New" w:cs="Courier New" w:hint="default"/>
       </w:rPr>
     </w:lvl>
     <w:lvl w:ilvl="2" w:tplc="100C0005" w:tentative="1">
@@ -5809,7 +5620,7 @@
         <w:ind w:left="3153" w:hanging="360"/>
       </w:pPr>
       <w:rPr>
-        <w:rFonts w:hint="default" w:ascii="Wingdings" w:hAnsi="Wingdings"/>
+        <w:rFonts w:ascii="Wingdings" w:hAnsi="Wingdings" w:hint="default"/>
       </w:rPr>
     </w:lvl>
     <w:lvl w:ilvl="3" w:tplc="100C0001" w:tentative="1">
@@ -5821,7 +5632,7 @@
         <w:ind w:left="3873" w:hanging="360"/>
       </w:pPr>
       <w:rPr>
-        <w:rFonts w:hint="default" w:ascii="Symbol" w:hAnsi="Symbol"/>
+        <w:rFonts w:ascii="Symbol" w:hAnsi="Symbol" w:hint="default"/>
       </w:rPr>
     </w:lvl>
     <w:lvl w:ilvl="4" w:tplc="100C0003" w:tentative="1">
@@ -5833,7 +5644,7 @@
         <w:ind w:left="4593" w:hanging="360"/>
       </w:pPr>
       <w:rPr>
-        <w:rFonts w:hint="default" w:ascii="Courier New" w:hAnsi="Courier New" w:cs="Courier New"/>
+        <w:rFonts w:ascii="Courier New" w:hAnsi="Courier New" w:cs="Courier New" w:hint="default"/>
       </w:rPr>
     </w:lvl>
     <w:lvl w:ilvl="5" w:tplc="100C0005" w:tentative="1">
@@ -5845,7 +5656,7 @@
         <w:ind w:left="5313" w:hanging="360"/>
       </w:pPr>
       <w:rPr>
-        <w:rFonts w:hint="default" w:ascii="Wingdings" w:hAnsi="Wingdings"/>
+        <w:rFonts w:ascii="Wingdings" w:hAnsi="Wingdings" w:hint="default"/>
       </w:rPr>
     </w:lvl>
     <w:lvl w:ilvl="6" w:tplc="100C0001" w:tentative="1">
@@ -5857,7 +5668,7 @@
         <w:ind w:left="6033" w:hanging="360"/>
       </w:pPr>
       <w:rPr>
-        <w:rFonts w:hint="default" w:ascii="Symbol" w:hAnsi="Symbol"/>
+        <w:rFonts w:ascii="Symbol" w:hAnsi="Symbol" w:hint="default"/>
       </w:rPr>
     </w:lvl>
     <w:lvl w:ilvl="7" w:tplc="100C0003" w:tentative="1">
@@ -5869,7 +5680,7 @@
         <w:ind w:left="6753" w:hanging="360"/>
       </w:pPr>
       <w:rPr>
-        <w:rFonts w:hint="default" w:ascii="Courier New" w:hAnsi="Courier New" w:cs="Courier New"/>
+        <w:rFonts w:ascii="Courier New" w:hAnsi="Courier New" w:cs="Courier New" w:hint="default"/>
       </w:rPr>
     </w:lvl>
     <w:lvl w:ilvl="8" w:tplc="100C0005" w:tentative="1">
@@ -5881,7 +5692,7 @@
         <w:ind w:left="7473" w:hanging="360"/>
       </w:pPr>
       <w:rPr>
-        <w:rFonts w:hint="default" w:ascii="Wingdings" w:hAnsi="Wingdings"/>
+        <w:rFonts w:ascii="Wingdings" w:hAnsi="Wingdings" w:hint="default"/>
       </w:rPr>
     </w:lvl>
   </w:abstractNum>
@@ -5901,7 +5712,7 @@
         <w:ind w:left="720" w:hanging="360"/>
       </w:pPr>
       <w:rPr>
-        <w:rFonts w:hint="default" w:ascii="Symbol" w:hAnsi="Symbol"/>
+        <w:rFonts w:ascii="Symbol" w:hAnsi="Symbol" w:hint="default"/>
       </w:rPr>
     </w:lvl>
     <w:lvl w:ilvl="1" w:tplc="100C0003" w:tentative="1">
@@ -5916,7 +5727,7 @@
         <w:ind w:left="1440" w:hanging="360"/>
       </w:pPr>
       <w:rPr>
-        <w:rFonts w:hint="default" w:ascii="Courier New" w:hAnsi="Courier New" w:cs="Courier New"/>
+        <w:rFonts w:ascii="Courier New" w:hAnsi="Courier New" w:cs="Courier New" w:hint="default"/>
       </w:rPr>
     </w:lvl>
     <w:lvl w:ilvl="2" w:tplc="100C0005" w:tentative="1">
@@ -5931,7 +5742,7 @@
         <w:ind w:left="2160" w:hanging="360"/>
       </w:pPr>
       <w:rPr>
-        <w:rFonts w:hint="default" w:ascii="Wingdings" w:hAnsi="Wingdings"/>
+        <w:rFonts w:ascii="Wingdings" w:hAnsi="Wingdings" w:hint="default"/>
       </w:rPr>
     </w:lvl>
     <w:lvl w:ilvl="3" w:tplc="100C0001" w:tentative="1">
@@ -5946,7 +5757,7 @@
         <w:ind w:left="2880" w:hanging="360"/>
       </w:pPr>
       <w:rPr>
-        <w:rFonts w:hint="default" w:ascii="Symbol" w:hAnsi="Symbol"/>
+        <w:rFonts w:ascii="Symbol" w:hAnsi="Symbol" w:hint="default"/>
       </w:rPr>
     </w:lvl>
     <w:lvl w:ilvl="4" w:tplc="100C0003" w:tentative="1">
@@ -5961,7 +5772,7 @@
         <w:ind w:left="3600" w:hanging="360"/>
       </w:pPr>
       <w:rPr>
-        <w:rFonts w:hint="default" w:ascii="Courier New" w:hAnsi="Courier New" w:cs="Courier New"/>
+        <w:rFonts w:ascii="Courier New" w:hAnsi="Courier New" w:cs="Courier New" w:hint="default"/>
       </w:rPr>
     </w:lvl>
     <w:lvl w:ilvl="5" w:tplc="100C0005" w:tentative="1">
@@ -5976,7 +5787,7 @@
         <w:ind w:left="4320" w:hanging="360"/>
       </w:pPr>
       <w:rPr>
-        <w:rFonts w:hint="default" w:ascii="Wingdings" w:hAnsi="Wingdings"/>
+        <w:rFonts w:ascii="Wingdings" w:hAnsi="Wingdings" w:hint="default"/>
       </w:rPr>
     </w:lvl>
     <w:lvl w:ilvl="6" w:tplc="100C0001" w:tentative="1">
@@ -5991,7 +5802,7 @@
         <w:ind w:left="5040" w:hanging="360"/>
       </w:pPr>
       <w:rPr>
-        <w:rFonts w:hint="default" w:ascii="Symbol" w:hAnsi="Symbol"/>
+        <w:rFonts w:ascii="Symbol" w:hAnsi="Symbol" w:hint="default"/>
       </w:rPr>
     </w:lvl>
     <w:lvl w:ilvl="7" w:tplc="100C0003" w:tentative="1">
@@ -6006,7 +5817,7 @@
         <w:ind w:left="5760" w:hanging="360"/>
       </w:pPr>
       <w:rPr>
-        <w:rFonts w:hint="default" w:ascii="Courier New" w:hAnsi="Courier New" w:cs="Courier New"/>
+        <w:rFonts w:ascii="Courier New" w:hAnsi="Courier New" w:cs="Courier New" w:hint="default"/>
       </w:rPr>
     </w:lvl>
     <w:lvl w:ilvl="8" w:tplc="100C0005" w:tentative="1">
@@ -6021,7 +5832,7 @@
         <w:ind w:left="6480" w:hanging="360"/>
       </w:pPr>
       <w:rPr>
-        <w:rFonts w:hint="default" w:ascii="Wingdings" w:hAnsi="Wingdings"/>
+        <w:rFonts w:ascii="Wingdings" w:hAnsi="Wingdings" w:hint="default"/>
       </w:rPr>
     </w:lvl>
   </w:abstractNum>
@@ -6190,7 +6001,7 @@
         <w:ind w:left="720" w:hanging="360"/>
       </w:pPr>
       <w:rPr>
-        <w:rFonts w:hint="default" w:ascii="Symbol" w:hAnsi="Symbol"/>
+        <w:rFonts w:ascii="Symbol" w:hAnsi="Symbol" w:hint="default"/>
       </w:rPr>
     </w:lvl>
     <w:lvl w:ilvl="1" w:tplc="040C0003" w:tentative="1">
@@ -6205,7 +6016,7 @@
         <w:ind w:left="1440" w:hanging="360"/>
       </w:pPr>
       <w:rPr>
-        <w:rFonts w:hint="default" w:ascii="Courier New" w:hAnsi="Courier New" w:cs="Courier New"/>
+        <w:rFonts w:ascii="Courier New" w:hAnsi="Courier New" w:cs="Courier New" w:hint="default"/>
       </w:rPr>
     </w:lvl>
     <w:lvl w:ilvl="2" w:tplc="040C0005" w:tentative="1">
@@ -6220,7 +6031,7 @@
         <w:ind w:left="2160" w:hanging="360"/>
       </w:pPr>
       <w:rPr>
-        <w:rFonts w:hint="default" w:ascii="Wingdings" w:hAnsi="Wingdings"/>
+        <w:rFonts w:ascii="Wingdings" w:hAnsi="Wingdings" w:hint="default"/>
       </w:rPr>
     </w:lvl>
     <w:lvl w:ilvl="3" w:tplc="040C0001" w:tentative="1">
@@ -6235,7 +6046,7 @@
         <w:ind w:left="2880" w:hanging="360"/>
       </w:pPr>
       <w:rPr>
-        <w:rFonts w:hint="default" w:ascii="Symbol" w:hAnsi="Symbol"/>
+        <w:rFonts w:ascii="Symbol" w:hAnsi="Symbol" w:hint="default"/>
       </w:rPr>
     </w:lvl>
     <w:lvl w:ilvl="4" w:tplc="040C0003" w:tentative="1">
@@ -6250,7 +6061,7 @@
         <w:ind w:left="3600" w:hanging="360"/>
       </w:pPr>
       <w:rPr>
-        <w:rFonts w:hint="default" w:ascii="Courier New" w:hAnsi="Courier New" w:cs="Courier New"/>
+        <w:rFonts w:ascii="Courier New" w:hAnsi="Courier New" w:cs="Courier New" w:hint="default"/>
       </w:rPr>
     </w:lvl>
     <w:lvl w:ilvl="5" w:tplc="040C0005" w:tentative="1">
@@ -6265,7 +6076,7 @@
         <w:ind w:left="4320" w:hanging="360"/>
       </w:pPr>
       <w:rPr>
-        <w:rFonts w:hint="default" w:ascii="Wingdings" w:hAnsi="Wingdings"/>
+        <w:rFonts w:ascii="Wingdings" w:hAnsi="Wingdings" w:hint="default"/>
       </w:rPr>
     </w:lvl>
     <w:lvl w:ilvl="6" w:tplc="040C0001" w:tentative="1">
@@ -6280,7 +6091,7 @@
         <w:ind w:left="5040" w:hanging="360"/>
       </w:pPr>
       <w:rPr>
-        <w:rFonts w:hint="default" w:ascii="Symbol" w:hAnsi="Symbol"/>
+        <w:rFonts w:ascii="Symbol" w:hAnsi="Symbol" w:hint="default"/>
       </w:rPr>
     </w:lvl>
     <w:lvl w:ilvl="7" w:tplc="040C0003" w:tentative="1">
@@ -6295,7 +6106,7 @@
         <w:ind w:left="5760" w:hanging="360"/>
       </w:pPr>
       <w:rPr>
-        <w:rFonts w:hint="default" w:ascii="Courier New" w:hAnsi="Courier New" w:cs="Courier New"/>
+        <w:rFonts w:ascii="Courier New" w:hAnsi="Courier New" w:cs="Courier New" w:hint="default"/>
       </w:rPr>
     </w:lvl>
     <w:lvl w:ilvl="8" w:tplc="040C0005" w:tentative="1">
@@ -6310,7 +6121,7 @@
         <w:ind w:left="6480" w:hanging="360"/>
       </w:pPr>
       <w:rPr>
-        <w:rFonts w:hint="default" w:ascii="Wingdings" w:hAnsi="Wingdings"/>
+        <w:rFonts w:ascii="Wingdings" w:hAnsi="Wingdings" w:hint="default"/>
       </w:rPr>
     </w:lvl>
   </w:abstractNum>
@@ -6327,7 +6138,7 @@
         <w:ind w:left="720" w:hanging="360"/>
       </w:pPr>
       <w:rPr>
-        <w:rFonts w:hint="default" w:ascii="Symbol" w:hAnsi="Symbol"/>
+        <w:rFonts w:ascii="Symbol" w:hAnsi="Symbol" w:hint="default"/>
       </w:rPr>
     </w:lvl>
     <w:lvl w:ilvl="1" w:tplc="100C0003" w:tentative="1">
@@ -6339,7 +6150,7 @@
         <w:ind w:left="1440" w:hanging="360"/>
       </w:pPr>
       <w:rPr>
-        <w:rFonts w:hint="default" w:ascii="Courier New" w:hAnsi="Courier New" w:cs="Courier New"/>
+        <w:rFonts w:ascii="Courier New" w:hAnsi="Courier New" w:cs="Courier New" w:hint="default"/>
       </w:rPr>
     </w:lvl>
     <w:lvl w:ilvl="2" w:tplc="100C0005" w:tentative="1">
@@ -6351,7 +6162,7 @@
         <w:ind w:left="2160" w:hanging="360"/>
       </w:pPr>
       <w:rPr>
-        <w:rFonts w:hint="default" w:ascii="Wingdings" w:hAnsi="Wingdings"/>
+        <w:rFonts w:ascii="Wingdings" w:hAnsi="Wingdings" w:hint="default"/>
       </w:rPr>
     </w:lvl>
     <w:lvl w:ilvl="3" w:tplc="100C0001" w:tentative="1">
@@ -6363,7 +6174,7 @@
         <w:ind w:left="2880" w:hanging="360"/>
       </w:pPr>
       <w:rPr>
-        <w:rFonts w:hint="default" w:ascii="Symbol" w:hAnsi="Symbol"/>
+        <w:rFonts w:ascii="Symbol" w:hAnsi="Symbol" w:hint="default"/>
       </w:rPr>
     </w:lvl>
     <w:lvl w:ilvl="4" w:tplc="100C0003" w:tentative="1">
@@ -6375,7 +6186,7 @@
         <w:ind w:left="3600" w:hanging="360"/>
       </w:pPr>
       <w:rPr>
-        <w:rFonts w:hint="default" w:ascii="Courier New" w:hAnsi="Courier New" w:cs="Courier New"/>
+        <w:rFonts w:ascii="Courier New" w:hAnsi="Courier New" w:cs="Courier New" w:hint="default"/>
       </w:rPr>
     </w:lvl>
     <w:lvl w:ilvl="5" w:tplc="100C0005" w:tentative="1">
@@ -6387,7 +6198,7 @@
         <w:ind w:left="4320" w:hanging="360"/>
       </w:pPr>
       <w:rPr>
-        <w:rFonts w:hint="default" w:ascii="Wingdings" w:hAnsi="Wingdings"/>
+        <w:rFonts w:ascii="Wingdings" w:hAnsi="Wingdings" w:hint="default"/>
       </w:rPr>
     </w:lvl>
     <w:lvl w:ilvl="6" w:tplc="100C0001" w:tentative="1">
@@ -6399,7 +6210,7 @@
         <w:ind w:left="5040" w:hanging="360"/>
       </w:pPr>
       <w:rPr>
-        <w:rFonts w:hint="default" w:ascii="Symbol" w:hAnsi="Symbol"/>
+        <w:rFonts w:ascii="Symbol" w:hAnsi="Symbol" w:hint="default"/>
       </w:rPr>
     </w:lvl>
     <w:lvl w:ilvl="7" w:tplc="100C0003" w:tentative="1">
@@ -6411,7 +6222,7 @@
         <w:ind w:left="5760" w:hanging="360"/>
       </w:pPr>
       <w:rPr>
-        <w:rFonts w:hint="default" w:ascii="Courier New" w:hAnsi="Courier New" w:cs="Courier New"/>
+        <w:rFonts w:ascii="Courier New" w:hAnsi="Courier New" w:cs="Courier New" w:hint="default"/>
       </w:rPr>
     </w:lvl>
     <w:lvl w:ilvl="8" w:tplc="100C0005" w:tentative="1">
@@ -6423,7 +6234,7 @@
         <w:ind w:left="6480" w:hanging="360"/>
       </w:pPr>
       <w:rPr>
-        <w:rFonts w:hint="default" w:ascii="Wingdings" w:hAnsi="Wingdings"/>
+        <w:rFonts w:ascii="Wingdings" w:hAnsi="Wingdings" w:hint="default"/>
       </w:rPr>
     </w:lvl>
   </w:abstractNum>
@@ -6440,7 +6251,7 @@
         <w:ind w:left="1154" w:hanging="360"/>
       </w:pPr>
       <w:rPr>
-        <w:rFonts w:hint="default" w:ascii="Symbol" w:hAnsi="Symbol"/>
+        <w:rFonts w:ascii="Symbol" w:hAnsi="Symbol" w:hint="default"/>
       </w:rPr>
     </w:lvl>
     <w:lvl w:ilvl="1" w:tplc="100C0003" w:tentative="1">
@@ -6452,7 +6263,7 @@
         <w:ind w:left="1874" w:hanging="360"/>
       </w:pPr>
       <w:rPr>
-        <w:rFonts w:hint="default" w:ascii="Courier New" w:hAnsi="Courier New" w:cs="Courier New"/>
+        <w:rFonts w:ascii="Courier New" w:hAnsi="Courier New" w:cs="Courier New" w:hint="default"/>
       </w:rPr>
     </w:lvl>
     <w:lvl w:ilvl="2" w:tplc="100C0005" w:tentative="1">
@@ -6464,7 +6275,7 @@
         <w:ind w:left="2594" w:hanging="360"/>
       </w:pPr>
       <w:rPr>
-        <w:rFonts w:hint="default" w:ascii="Wingdings" w:hAnsi="Wingdings"/>
+        <w:rFonts w:ascii="Wingdings" w:hAnsi="Wingdings" w:hint="default"/>
       </w:rPr>
     </w:lvl>
     <w:lvl w:ilvl="3" w:tplc="100C0001" w:tentative="1">
@@ -6476,7 +6287,7 @@
         <w:ind w:left="3314" w:hanging="360"/>
       </w:pPr>
       <w:rPr>
-        <w:rFonts w:hint="default" w:ascii="Symbol" w:hAnsi="Symbol"/>
+        <w:rFonts w:ascii="Symbol" w:hAnsi="Symbol" w:hint="default"/>
       </w:rPr>
     </w:lvl>
     <w:lvl w:ilvl="4" w:tplc="100C0003" w:tentative="1">
@@ -6488,7 +6299,7 @@
         <w:ind w:left="4034" w:hanging="360"/>
       </w:pPr>
       <w:rPr>
-        <w:rFonts w:hint="default" w:ascii="Courier New" w:hAnsi="Courier New" w:cs="Courier New"/>
+        <w:rFonts w:ascii="Courier New" w:hAnsi="Courier New" w:cs="Courier New" w:hint="default"/>
       </w:rPr>
     </w:lvl>
     <w:lvl w:ilvl="5" w:tplc="100C0005" w:tentative="1">
@@ -6500,7 +6311,7 @@
         <w:ind w:left="4754" w:hanging="360"/>
       </w:pPr>
       <w:rPr>
-        <w:rFonts w:hint="default" w:ascii="Wingdings" w:hAnsi="Wingdings"/>
+        <w:rFonts w:ascii="Wingdings" w:hAnsi="Wingdings" w:hint="default"/>
       </w:rPr>
     </w:lvl>
     <w:lvl w:ilvl="6" w:tplc="100C0001" w:tentative="1">
@@ -6512,7 +6323,7 @@
         <w:ind w:left="5474" w:hanging="360"/>
       </w:pPr>
       <w:rPr>
-        <w:rFonts w:hint="default" w:ascii="Symbol" w:hAnsi="Symbol"/>
+        <w:rFonts w:ascii="Symbol" w:hAnsi="Symbol" w:hint="default"/>
       </w:rPr>
     </w:lvl>
     <w:lvl w:ilvl="7" w:tplc="100C0003" w:tentative="1">
@@ -6524,7 +6335,7 @@
         <w:ind w:left="6194" w:hanging="360"/>
       </w:pPr>
       <w:rPr>
-        <w:rFonts w:hint="default" w:ascii="Courier New" w:hAnsi="Courier New" w:cs="Courier New"/>
+        <w:rFonts w:ascii="Courier New" w:hAnsi="Courier New" w:cs="Courier New" w:hint="default"/>
       </w:rPr>
     </w:lvl>
     <w:lvl w:ilvl="8" w:tplc="100C0005" w:tentative="1">
@@ -6536,7 +6347,7 @@
         <w:ind w:left="6914" w:hanging="360"/>
       </w:pPr>
       <w:rPr>
-        <w:rFonts w:hint="default" w:ascii="Wingdings" w:hAnsi="Wingdings"/>
+        <w:rFonts w:ascii="Wingdings" w:hAnsi="Wingdings" w:hint="default"/>
       </w:rPr>
     </w:lvl>
   </w:abstractNum>
@@ -6553,7 +6364,7 @@
         <w:ind w:left="720" w:hanging="360"/>
       </w:pPr>
       <w:rPr>
-        <w:rFonts w:hint="default" w:ascii="Symbol" w:hAnsi="Symbol"/>
+        <w:rFonts w:ascii="Symbol" w:hAnsi="Symbol" w:hint="default"/>
       </w:rPr>
     </w:lvl>
     <w:lvl w:ilvl="1" w:tplc="100C0003">
@@ -6565,7 +6376,7 @@
         <w:ind w:left="1440" w:hanging="360"/>
       </w:pPr>
       <w:rPr>
-        <w:rFonts w:hint="default" w:ascii="Courier New" w:hAnsi="Courier New" w:cs="Courier New"/>
+        <w:rFonts w:ascii="Courier New" w:hAnsi="Courier New" w:cs="Courier New" w:hint="default"/>
       </w:rPr>
     </w:lvl>
     <w:lvl w:ilvl="2" w:tplc="100C0005" w:tentative="1">
@@ -6577,7 +6388,7 @@
         <w:ind w:left="2160" w:hanging="360"/>
       </w:pPr>
       <w:rPr>
-        <w:rFonts w:hint="default" w:ascii="Wingdings" w:hAnsi="Wingdings"/>
+        <w:rFonts w:ascii="Wingdings" w:hAnsi="Wingdings" w:hint="default"/>
       </w:rPr>
     </w:lvl>
     <w:lvl w:ilvl="3" w:tplc="100C0001" w:tentative="1">
@@ -6589,7 +6400,7 @@
         <w:ind w:left="2880" w:hanging="360"/>
       </w:pPr>
       <w:rPr>
-        <w:rFonts w:hint="default" w:ascii="Symbol" w:hAnsi="Symbol"/>
+        <w:rFonts w:ascii="Symbol" w:hAnsi="Symbol" w:hint="default"/>
       </w:rPr>
     </w:lvl>
     <w:lvl w:ilvl="4" w:tplc="100C0003" w:tentative="1">
@@ -6601,7 +6412,7 @@
         <w:ind w:left="3600" w:hanging="360"/>
       </w:pPr>
       <w:rPr>
-        <w:rFonts w:hint="default" w:ascii="Courier New" w:hAnsi="Courier New" w:cs="Courier New"/>
+        <w:rFonts w:ascii="Courier New" w:hAnsi="Courier New" w:cs="Courier New" w:hint="default"/>
       </w:rPr>
     </w:lvl>
     <w:lvl w:ilvl="5" w:tplc="100C0005" w:tentative="1">
@@ -6613,7 +6424,7 @@
         <w:ind w:left="4320" w:hanging="360"/>
       </w:pPr>
       <w:rPr>
-        <w:rFonts w:hint="default" w:ascii="Wingdings" w:hAnsi="Wingdings"/>
+        <w:rFonts w:ascii="Wingdings" w:hAnsi="Wingdings" w:hint="default"/>
       </w:rPr>
     </w:lvl>
     <w:lvl w:ilvl="6" w:tplc="100C0001" w:tentative="1">
@@ -6625,7 +6436,7 @@
         <w:ind w:left="5040" w:hanging="360"/>
       </w:pPr>
       <w:rPr>
-        <w:rFonts w:hint="default" w:ascii="Symbol" w:hAnsi="Symbol"/>
+        <w:rFonts w:ascii="Symbol" w:hAnsi="Symbol" w:hint="default"/>
       </w:rPr>
     </w:lvl>
     <w:lvl w:ilvl="7" w:tplc="100C0003" w:tentative="1">
@@ -6637,7 +6448,7 @@
         <w:ind w:left="5760" w:hanging="360"/>
       </w:pPr>
       <w:rPr>
-        <w:rFonts w:hint="default" w:ascii="Courier New" w:hAnsi="Courier New" w:cs="Courier New"/>
+        <w:rFonts w:ascii="Courier New" w:hAnsi="Courier New" w:cs="Courier New" w:hint="default"/>
       </w:rPr>
     </w:lvl>
     <w:lvl w:ilvl="8" w:tplc="100C0005" w:tentative="1">
@@ -6649,7 +6460,7 @@
         <w:ind w:left="6480" w:hanging="360"/>
       </w:pPr>
       <w:rPr>
-        <w:rFonts w:hint="default" w:ascii="Wingdings" w:hAnsi="Wingdings"/>
+        <w:rFonts w:ascii="Wingdings" w:hAnsi="Wingdings" w:hint="default"/>
       </w:rPr>
     </w:lvl>
   </w:abstractNum>
@@ -6666,7 +6477,7 @@
         <w:ind w:left="780" w:hanging="360"/>
       </w:pPr>
       <w:rPr>
-        <w:rFonts w:hint="default" w:ascii="Symbol" w:hAnsi="Symbol"/>
+        <w:rFonts w:ascii="Symbol" w:hAnsi="Symbol" w:hint="default"/>
       </w:rPr>
     </w:lvl>
     <w:lvl w:ilvl="1" w:tplc="100C0003" w:tentative="1">
@@ -6678,7 +6489,7 @@
         <w:ind w:left="1500" w:hanging="360"/>
       </w:pPr>
       <w:rPr>
-        <w:rFonts w:hint="default" w:ascii="Courier New" w:hAnsi="Courier New" w:cs="Courier New"/>
+        <w:rFonts w:ascii="Courier New" w:hAnsi="Courier New" w:cs="Courier New" w:hint="default"/>
       </w:rPr>
     </w:lvl>
     <w:lvl w:ilvl="2" w:tplc="100C0005" w:tentative="1">
@@ -6690,7 +6501,7 @@
         <w:ind w:left="2220" w:hanging="360"/>
       </w:pPr>
       <w:rPr>
-        <w:rFonts w:hint="default" w:ascii="Wingdings" w:hAnsi="Wingdings"/>
+        <w:rFonts w:ascii="Wingdings" w:hAnsi="Wingdings" w:hint="default"/>
       </w:rPr>
     </w:lvl>
     <w:lvl w:ilvl="3" w:tplc="100C0001" w:tentative="1">
@@ -6702,7 +6513,7 @@
         <w:ind w:left="2940" w:hanging="360"/>
       </w:pPr>
       <w:rPr>
-        <w:rFonts w:hint="default" w:ascii="Symbol" w:hAnsi="Symbol"/>
+        <w:rFonts w:ascii="Symbol" w:hAnsi="Symbol" w:hint="default"/>
       </w:rPr>
     </w:lvl>
     <w:lvl w:ilvl="4" w:tplc="100C0003" w:tentative="1">
@@ -6714,7 +6525,7 @@
         <w:ind w:left="3660" w:hanging="360"/>
       </w:pPr>
       <w:rPr>
-        <w:rFonts w:hint="default" w:ascii="Courier New" w:hAnsi="Courier New" w:cs="Courier New"/>
+        <w:rFonts w:ascii="Courier New" w:hAnsi="Courier New" w:cs="Courier New" w:hint="default"/>
       </w:rPr>
     </w:lvl>
     <w:lvl w:ilvl="5" w:tplc="100C0005" w:tentative="1">
@@ -6726,7 +6537,7 @@
         <w:ind w:left="4380" w:hanging="360"/>
       </w:pPr>
       <w:rPr>
-        <w:rFonts w:hint="default" w:ascii="Wingdings" w:hAnsi="Wingdings"/>
+        <w:rFonts w:ascii="Wingdings" w:hAnsi="Wingdings" w:hint="default"/>
       </w:rPr>
     </w:lvl>
     <w:lvl w:ilvl="6" w:tplc="100C0001" w:tentative="1">
@@ -6738,7 +6549,7 @@
         <w:ind w:left="5100" w:hanging="360"/>
       </w:pPr>
       <w:rPr>
-        <w:rFonts w:hint="default" w:ascii="Symbol" w:hAnsi="Symbol"/>
+        <w:rFonts w:ascii="Symbol" w:hAnsi="Symbol" w:hint="default"/>
       </w:rPr>
     </w:lvl>
     <w:lvl w:ilvl="7" w:tplc="100C0003" w:tentative="1">
@@ -6750,7 +6561,7 @@
         <w:ind w:left="5820" w:hanging="360"/>
       </w:pPr>
       <w:rPr>
-        <w:rFonts w:hint="default" w:ascii="Courier New" w:hAnsi="Courier New" w:cs="Courier New"/>
+        <w:rFonts w:ascii="Courier New" w:hAnsi="Courier New" w:cs="Courier New" w:hint="default"/>
       </w:rPr>
     </w:lvl>
     <w:lvl w:ilvl="8" w:tplc="100C0005" w:tentative="1">
@@ -6762,7 +6573,7 @@
         <w:ind w:left="6540" w:hanging="360"/>
       </w:pPr>
       <w:rPr>
-        <w:rFonts w:hint="default" w:ascii="Wingdings" w:hAnsi="Wingdings"/>
+        <w:rFonts w:ascii="Wingdings" w:hAnsi="Wingdings" w:hint="default"/>
       </w:rPr>
     </w:lvl>
   </w:abstractNum>
@@ -6779,7 +6590,7 @@
         <w:ind w:left="1713" w:hanging="360"/>
       </w:pPr>
       <w:rPr>
-        <w:rFonts w:hint="default" w:ascii="Symbol" w:hAnsi="Symbol"/>
+        <w:rFonts w:ascii="Symbol" w:hAnsi="Symbol" w:hint="default"/>
       </w:rPr>
     </w:lvl>
     <w:lvl w:ilvl="1" w:tplc="100C0003" w:tentative="1">
@@ -6791,7 +6602,7 @@
         <w:ind w:left="2433" w:hanging="360"/>
       </w:pPr>
       <w:rPr>
-        <w:rFonts w:hint="default" w:ascii="Courier New" w:hAnsi="Courier New" w:cs="Courier New"/>
+        <w:rFonts w:ascii="Courier New" w:hAnsi="Courier New" w:cs="Courier New" w:hint="default"/>
       </w:rPr>
     </w:lvl>
     <w:lvl w:ilvl="2" w:tplc="100C0005" w:tentative="1">
@@ -6803,7 +6614,7 @@
         <w:ind w:left="3153" w:hanging="360"/>
       </w:pPr>
       <w:rPr>
-        <w:rFonts w:hint="default" w:ascii="Wingdings" w:hAnsi="Wingdings"/>
+        <w:rFonts w:ascii="Wingdings" w:hAnsi="Wingdings" w:hint="default"/>
       </w:rPr>
     </w:lvl>
     <w:lvl w:ilvl="3" w:tplc="100C0001" w:tentative="1">
@@ -6815,7 +6626,7 @@
         <w:ind w:left="3873" w:hanging="360"/>
       </w:pPr>
       <w:rPr>
-        <w:rFonts w:hint="default" w:ascii="Symbol" w:hAnsi="Symbol"/>
+        <w:rFonts w:ascii="Symbol" w:hAnsi="Symbol" w:hint="default"/>
       </w:rPr>
     </w:lvl>
     <w:lvl w:ilvl="4" w:tplc="100C0003" w:tentative="1">
@@ -6827,7 +6638,7 @@
         <w:ind w:left="4593" w:hanging="360"/>
       </w:pPr>
       <w:rPr>
-        <w:rFonts w:hint="default" w:ascii="Courier New" w:hAnsi="Courier New" w:cs="Courier New"/>
+        <w:rFonts w:ascii="Courier New" w:hAnsi="Courier New" w:cs="Courier New" w:hint="default"/>
       </w:rPr>
     </w:lvl>
     <w:lvl w:ilvl="5" w:tplc="100C0005" w:tentative="1">
@@ -6839,7 +6650,7 @@
         <w:ind w:left="5313" w:hanging="360"/>
       </w:pPr>
       <w:rPr>
-        <w:rFonts w:hint="default" w:ascii="Wingdings" w:hAnsi="Wingdings"/>
+        <w:rFonts w:ascii="Wingdings" w:hAnsi="Wingdings" w:hint="default"/>
       </w:rPr>
     </w:lvl>
     <w:lvl w:ilvl="6" w:tplc="100C0001" w:tentative="1">
@@ -6851,7 +6662,7 @@
         <w:ind w:left="6033" w:hanging="360"/>
       </w:pPr>
       <w:rPr>
-        <w:rFonts w:hint="default" w:ascii="Symbol" w:hAnsi="Symbol"/>
+        <w:rFonts w:ascii="Symbol" w:hAnsi="Symbol" w:hint="default"/>
       </w:rPr>
     </w:lvl>
     <w:lvl w:ilvl="7" w:tplc="100C0003" w:tentative="1">
@@ -6863,7 +6674,7 @@
         <w:ind w:left="6753" w:hanging="360"/>
       </w:pPr>
       <w:rPr>
-        <w:rFonts w:hint="default" w:ascii="Courier New" w:hAnsi="Courier New" w:cs="Courier New"/>
+        <w:rFonts w:ascii="Courier New" w:hAnsi="Courier New" w:cs="Courier New" w:hint="default"/>
       </w:rPr>
     </w:lvl>
     <w:lvl w:ilvl="8" w:tplc="100C0005" w:tentative="1">
@@ -6875,7 +6686,7 @@
         <w:ind w:left="7473" w:hanging="360"/>
       </w:pPr>
       <w:rPr>
-        <w:rFonts w:hint="default" w:ascii="Wingdings" w:hAnsi="Wingdings"/>
+        <w:rFonts w:ascii="Wingdings" w:hAnsi="Wingdings" w:hint="default"/>
       </w:rPr>
     </w:lvl>
   </w:abstractNum>
@@ -6940,11 +6751,11 @@
 </file>
 
 <file path=word/styles.xml><?xml version="1.0" encoding="utf-8"?>
-<w:styles xmlns:wp14="http://schemas.microsoft.com/office/word/2010/wordprocessingDrawing" xmlns:mc="http://schemas.openxmlformats.org/markup-compatibility/2006" xmlns:r="http://schemas.openxmlformats.org/officeDocument/2006/relationships" xmlns:w="http://schemas.openxmlformats.org/wordprocessingml/2006/main" xmlns:w14="http://schemas.microsoft.com/office/word/2010/wordml" xmlns:w15="http://schemas.microsoft.com/office/word/2012/wordml" xmlns:w16cex="http://schemas.microsoft.com/office/word/2018/wordml/cex" xmlns:w16cid="http://schemas.microsoft.com/office/word/2016/wordml/cid" xmlns:w16="http://schemas.microsoft.com/office/word/2018/wordml" xmlns:w16du="http://schemas.microsoft.com/office/word/2023/wordml/word16du" xmlns:w16sdtdh="http://schemas.microsoft.com/office/word/2020/wordml/sdtdatahash" xmlns:w16sdtfl="http://schemas.microsoft.com/office/word/2024/wordml/sdtformatlock" xmlns:w16se="http://schemas.microsoft.com/office/word/2015/wordml/symex" mc:Ignorable="w14 w15 w16se w16cid w16 w16cex w16sdtdh w16sdtfl w16du wp14">
+<w:styles xmlns:mc="http://schemas.openxmlformats.org/markup-compatibility/2006" xmlns:r="http://schemas.openxmlformats.org/officeDocument/2006/relationships" xmlns:w="http://schemas.openxmlformats.org/wordprocessingml/2006/main" xmlns:w14="http://schemas.microsoft.com/office/word/2010/wordml" xmlns:w15="http://schemas.microsoft.com/office/word/2012/wordml" xmlns:w16cex="http://schemas.microsoft.com/office/word/2018/wordml/cex" xmlns:w16cid="http://schemas.microsoft.com/office/word/2016/wordml/cid" xmlns:w16="http://schemas.microsoft.com/office/word/2018/wordml" xmlns:w16sdtdh="http://schemas.microsoft.com/office/word/2020/wordml/sdtdatahash" xmlns:w16se="http://schemas.microsoft.com/office/word/2015/wordml/symex" mc:Ignorable="w14 w15 w16se w16cid w16 w16cex w16sdtdh">
   <w:docDefaults>
     <w:rPrDefault>
       <w:rPr>
-        <w:rFonts w:asciiTheme="minorHAnsi" w:hAnsiTheme="minorHAnsi" w:eastAsiaTheme="minorHAnsi" w:cstheme="minorBidi"/>
+        <w:rFonts w:asciiTheme="minorHAnsi" w:eastAsiaTheme="minorHAnsi" w:hAnsiTheme="minorHAnsi" w:cstheme="minorBidi"/>
         <w:sz w:val="22"/>
         <w:szCs w:val="22"/>
         <w:lang w:val="fr-CH" w:eastAsia="en-US" w:bidi="ar-SA"/>
@@ -6959,14 +6770,14 @@
   <w:latentStyles w:defLockedState="0" w:defUIPriority="99" w:defSemiHidden="0" w:defUnhideWhenUsed="0" w:defQFormat="0" w:count="376">
     <w:lsdException w:name="Normal" w:uiPriority="0" w:qFormat="1"/>
     <w:lsdException w:name="heading 1" w:uiPriority="0" w:qFormat="1"/>
-    <w:lsdException w:name="heading 2" w:uiPriority="0" w:semiHidden="1" w:unhideWhenUsed="1" w:qFormat="1"/>
-    <w:lsdException w:name="heading 3" w:uiPriority="0" w:semiHidden="1" w:unhideWhenUsed="1" w:qFormat="1"/>
-    <w:lsdException w:name="heading 4" w:uiPriority="0" w:semiHidden="1" w:unhideWhenUsed="1" w:qFormat="1"/>
-    <w:lsdException w:name="heading 5" w:uiPriority="0" w:semiHidden="1" w:unhideWhenUsed="1" w:qFormat="1"/>
-    <w:lsdException w:name="heading 6" w:uiPriority="0" w:semiHidden="1" w:unhideWhenUsed="1" w:qFormat="1"/>
-    <w:lsdException w:name="heading 7" w:uiPriority="0" w:semiHidden="1" w:unhideWhenUsed="1" w:qFormat="1"/>
-    <w:lsdException w:name="heading 8" w:uiPriority="0" w:semiHidden="1" w:unhideWhenUsed="1" w:qFormat="1"/>
-    <w:lsdException w:name="heading 9" w:uiPriority="0" w:semiHidden="1" w:unhideWhenUsed="1" w:qFormat="1"/>
+    <w:lsdException w:name="heading 2" w:semiHidden="1" w:uiPriority="0" w:unhideWhenUsed="1" w:qFormat="1"/>
+    <w:lsdException w:name="heading 3" w:semiHidden="1" w:uiPriority="0" w:unhideWhenUsed="1" w:qFormat="1"/>
+    <w:lsdException w:name="heading 4" w:semiHidden="1" w:uiPriority="0" w:unhideWhenUsed="1" w:qFormat="1"/>
+    <w:lsdException w:name="heading 5" w:semiHidden="1" w:uiPriority="0" w:unhideWhenUsed="1" w:qFormat="1"/>
+    <w:lsdException w:name="heading 6" w:semiHidden="1" w:uiPriority="0" w:unhideWhenUsed="1" w:qFormat="1"/>
+    <w:lsdException w:name="heading 7" w:semiHidden="1" w:uiPriority="0" w:unhideWhenUsed="1" w:qFormat="1"/>
+    <w:lsdException w:name="heading 8" w:semiHidden="1" w:uiPriority="0" w:unhideWhenUsed="1" w:qFormat="1"/>
+    <w:lsdException w:name="heading 9" w:semiHidden="1" w:uiPriority="0" w:unhideWhenUsed="1" w:qFormat="1"/>
     <w:lsdException w:name="index 1" w:semiHidden="1" w:unhideWhenUsed="1"/>
     <w:lsdException w:name="index 2" w:semiHidden="1" w:unhideWhenUsed="1"/>
     <w:lsdException w:name="index 3" w:semiHidden="1" w:unhideWhenUsed="1"/>
@@ -6976,26 +6787,26 @@
     <w:lsdException w:name="index 7" w:semiHidden="1" w:unhideWhenUsed="1"/>
     <w:lsdException w:name="index 8" w:semiHidden="1" w:unhideWhenUsed="1"/>
     <w:lsdException w:name="index 9" w:semiHidden="1" w:unhideWhenUsed="1"/>
-    <w:lsdException w:name="toc 1" w:uiPriority="39" w:semiHidden="1" w:unhideWhenUsed="1"/>
-    <w:lsdException w:name="toc 2" w:uiPriority="39" w:semiHidden="1" w:unhideWhenUsed="1"/>
-    <w:lsdException w:name="toc 3" w:uiPriority="39" w:semiHidden="1" w:unhideWhenUsed="1"/>
-    <w:lsdException w:name="toc 4" w:uiPriority="39" w:semiHidden="1" w:unhideWhenUsed="1"/>
-    <w:lsdException w:name="toc 5" w:uiPriority="39" w:semiHidden="1" w:unhideWhenUsed="1"/>
-    <w:lsdException w:name="toc 6" w:uiPriority="39" w:semiHidden="1" w:unhideWhenUsed="1"/>
-    <w:lsdException w:name="toc 7" w:uiPriority="39" w:semiHidden="1" w:unhideWhenUsed="1"/>
-    <w:lsdException w:name="toc 8" w:uiPriority="39" w:semiHidden="1" w:unhideWhenUsed="1"/>
-    <w:lsdException w:name="toc 9" w:uiPriority="39" w:semiHidden="1" w:unhideWhenUsed="1"/>
+    <w:lsdException w:name="toc 1" w:semiHidden="1" w:uiPriority="39" w:unhideWhenUsed="1"/>
+    <w:lsdException w:name="toc 2" w:semiHidden="1" w:uiPriority="39" w:unhideWhenUsed="1"/>
+    <w:lsdException w:name="toc 3" w:semiHidden="1" w:uiPriority="39" w:unhideWhenUsed="1"/>
+    <w:lsdException w:name="toc 4" w:semiHidden="1" w:uiPriority="39" w:unhideWhenUsed="1"/>
+    <w:lsdException w:name="toc 5" w:semiHidden="1" w:uiPriority="39" w:unhideWhenUsed="1"/>
+    <w:lsdException w:name="toc 6" w:semiHidden="1" w:uiPriority="39" w:unhideWhenUsed="1"/>
+    <w:lsdException w:name="toc 7" w:semiHidden="1" w:uiPriority="39" w:unhideWhenUsed="1"/>
+    <w:lsdException w:name="toc 8" w:semiHidden="1" w:uiPriority="39" w:unhideWhenUsed="1"/>
+    <w:lsdException w:name="toc 9" w:semiHidden="1" w:uiPriority="39" w:unhideWhenUsed="1"/>
     <w:lsdException w:name="Normal Indent" w:semiHidden="1" w:unhideWhenUsed="1"/>
-    <w:lsdException w:name="footnote text" w:uiPriority="0" w:semiHidden="1" w:unhideWhenUsed="1"/>
+    <w:lsdException w:name="footnote text" w:semiHidden="1" w:uiPriority="0" w:unhideWhenUsed="1"/>
     <w:lsdException w:name="annotation text" w:semiHidden="1" w:unhideWhenUsed="1"/>
-    <w:lsdException w:name="header" w:uiPriority="0" w:semiHidden="1" w:unhideWhenUsed="1"/>
-    <w:lsdException w:name="footer" w:uiPriority="0" w:semiHidden="1" w:unhideWhenUsed="1"/>
+    <w:lsdException w:name="header" w:semiHidden="1" w:uiPriority="0" w:unhideWhenUsed="1"/>
+    <w:lsdException w:name="footer" w:semiHidden="1" w:uiPriority="0" w:unhideWhenUsed="1"/>
     <w:lsdException w:name="index heading" w:semiHidden="1" w:unhideWhenUsed="1"/>
-    <w:lsdException w:name="caption" w:uiPriority="35" w:semiHidden="1" w:unhideWhenUsed="1" w:qFormat="1"/>
+    <w:lsdException w:name="caption" w:semiHidden="1" w:uiPriority="35" w:unhideWhenUsed="1" w:qFormat="1"/>
     <w:lsdException w:name="table of figures" w:semiHidden="1" w:unhideWhenUsed="1"/>
     <w:lsdException w:name="envelope address" w:semiHidden="1" w:unhideWhenUsed="1"/>
     <w:lsdException w:name="envelope return" w:semiHidden="1" w:unhideWhenUsed="1"/>
-    <w:lsdException w:name="footnote reference" w:uiPriority="0" w:semiHidden="1" w:unhideWhenUsed="1"/>
+    <w:lsdException w:name="footnote reference" w:semiHidden="1" w:uiPriority="0" w:unhideWhenUsed="1"/>
     <w:lsdException w:name="annotation reference" w:semiHidden="1" w:unhideWhenUsed="1"/>
     <w:lsdException w:name="line number" w:semiHidden="1" w:unhideWhenUsed="1"/>
     <w:lsdException w:name="page number" w:semiHidden="1" w:unhideWhenUsed="1"/>
@@ -7022,8 +6833,8 @@
     <w:lsdException w:name="Title" w:uiPriority="10" w:qFormat="1"/>
     <w:lsdException w:name="Closing" w:semiHidden="1" w:unhideWhenUsed="1"/>
     <w:lsdException w:name="Signature" w:semiHidden="1" w:unhideWhenUsed="1"/>
-    <w:lsdException w:name="Default Paragraph Font" w:uiPriority="1" w:semiHidden="1" w:unhideWhenUsed="1"/>
-    <w:lsdException w:name="Body Text" w:uiPriority="0" w:semiHidden="1" w:unhideWhenUsed="1"/>
+    <w:lsdException w:name="Default Paragraph Font" w:semiHidden="1" w:uiPriority="1" w:unhideWhenUsed="1"/>
+    <w:lsdException w:name="Body Text" w:semiHidden="1" w:uiPriority="0" w:unhideWhenUsed="1"/>
     <w:lsdException w:name="Body Text Indent" w:semiHidden="1" w:unhideWhenUsed="1"/>
     <w:lsdException w:name="List Continue" w:semiHidden="1" w:unhideWhenUsed="1"/>
     <w:lsdException w:name="List Continue 2" w:semiHidden="1" w:unhideWhenUsed="1"/>
@@ -7042,7 +6853,7 @@
     <w:lsdException w:name="Body Text Indent 2" w:semiHidden="1" w:unhideWhenUsed="1"/>
     <w:lsdException w:name="Body Text Indent 3" w:semiHidden="1" w:unhideWhenUsed="1"/>
     <w:lsdException w:name="Block Text" w:semiHidden="1" w:unhideWhenUsed="1"/>
-    <w:lsdException w:name="Hyperlink" w:uiPriority="0" w:semiHidden="1" w:unhideWhenUsed="1"/>
+    <w:lsdException w:name="Hyperlink" w:semiHidden="1" w:uiPriority="0" w:unhideWhenUsed="1"/>
     <w:lsdException w:name="FollowedHyperlink" w:semiHidden="1" w:unhideWhenUsed="1"/>
     <w:lsdException w:name="Strong" w:uiPriority="22" w:qFormat="1"/>
     <w:lsdException w:name="Emphasis" w:uiPriority="20" w:qFormat="1"/>
@@ -7222,8 +7033,8 @@
     <w:lsdException w:name="Subtle Reference" w:uiPriority="31" w:qFormat="1"/>
     <w:lsdException w:name="Intense Reference" w:uiPriority="32" w:qFormat="1"/>
     <w:lsdException w:name="Book Title" w:uiPriority="33" w:qFormat="1"/>
-    <w:lsdException w:name="Bibliography" w:uiPriority="37" w:semiHidden="1" w:unhideWhenUsed="1"/>
-    <w:lsdException w:name="TOC Heading" w:uiPriority="39" w:semiHidden="1" w:unhideWhenUsed="1" w:qFormat="1"/>
+    <w:lsdException w:name="Bibliography" w:semiHidden="1" w:uiPriority="37" w:unhideWhenUsed="1"/>
+    <w:lsdException w:name="TOC Heading" w:semiHidden="1" w:uiPriority="39" w:unhideWhenUsed="1" w:qFormat="1"/>
     <w:lsdException w:name="Plain Table 1" w:uiPriority="41"/>
     <w:lsdException w:name="Plain Table 2" w:uiPriority="42"/>
     <w:lsdException w:name="Plain Table 3" w:uiPriority="43"/>
@@ -7334,7 +7145,7 @@
     <w:lsdException w:name="Unresolved Mention" w:semiHidden="1" w:unhideWhenUsed="1"/>
     <w:lsdException w:name="Smart Link" w:semiHidden="1" w:unhideWhenUsed="1"/>
   </w:latentStyles>
-  <w:style w:type="paragraph" w:styleId="Normal" w:default="1">
+  <w:style w:type="paragraph" w:default="1" w:styleId="Normal">
     <w:name w:val="Normal"/>
     <w:qFormat/>
     <w:rsid w:val="00B67D76"/>
@@ -7342,7 +7153,7 @@
       <w:spacing w:after="0" w:line="240" w:lineRule="auto"/>
     </w:pPr>
     <w:rPr>
-      <w:rFonts w:ascii="Arial" w:hAnsi="Arial" w:eastAsia="Times New Roman" w:cs="Times New Roman"/>
+      <w:rFonts w:ascii="Arial" w:eastAsia="Times New Roman" w:hAnsi="Arial" w:cs="Times New Roman"/>
       <w:lang w:val="fr-FR" w:eastAsia="fr-FR"/>
     </w:rPr>
   </w:style>
@@ -7358,7 +7169,7 @@
         <w:numId w:val="1"/>
       </w:numPr>
       <w:pBdr>
-        <w:top w:val="single" w:color="auto" w:sz="4" w:space="1"/>
+        <w:top w:val="single" w:sz="4" w:space="1" w:color="auto"/>
       </w:pBdr>
       <w:spacing w:before="360" w:after="240"/>
       <w:outlineLvl w:val="0"/>
@@ -7549,13 +7360,13 @@
       <w:rFonts w:cs="Arial"/>
     </w:rPr>
   </w:style>
-  <w:style w:type="character" w:styleId="Policepardfaut" w:default="1">
+  <w:style w:type="character" w:default="1" w:styleId="Policepardfaut">
     <w:name w:val="Default Paragraph Font"/>
     <w:uiPriority w:val="1"/>
     <w:semiHidden/>
     <w:unhideWhenUsed/>
   </w:style>
-  <w:style w:type="table" w:styleId="TableauNormal" w:default="1">
+  <w:style w:type="table" w:default="1" w:styleId="TableauNormal">
     <w:name w:val="Normal Table"/>
     <w:uiPriority w:val="99"/>
     <w:semiHidden/>
@@ -7570,19 +7381,19 @@
       </w:tblCellMar>
     </w:tblPr>
   </w:style>
-  <w:style w:type="numbering" w:styleId="Aucuneliste" w:default="1">
+  <w:style w:type="numbering" w:default="1" w:styleId="Aucuneliste">
     <w:name w:val="No List"/>
     <w:uiPriority w:val="99"/>
     <w:semiHidden/>
     <w:unhideWhenUsed/>
   </w:style>
-  <w:style w:type="character" w:styleId="Titre1Car" w:customStyle="1">
+  <w:style w:type="character" w:customStyle="1" w:styleId="Titre1Car">
     <w:name w:val="Titre 1 Car"/>
     <w:basedOn w:val="Policepardfaut"/>
     <w:link w:val="Titre1"/>
     <w:rsid w:val="00B67D76"/>
     <w:rPr>
-      <w:rFonts w:ascii="Arial" w:hAnsi="Arial" w:eastAsia="Times New Roman" w:cs="Times New Roman"/>
+      <w:rFonts w:ascii="Arial" w:eastAsia="Times New Roman" w:hAnsi="Arial" w:cs="Times New Roman"/>
       <w:b/>
       <w:bCs/>
       <w:sz w:val="28"/>
@@ -7590,25 +7401,25 @@
       <w:lang w:val="fr-FR" w:eastAsia="fr-FR"/>
     </w:rPr>
   </w:style>
-  <w:style w:type="character" w:styleId="Titre2Car" w:customStyle="1">
+  <w:style w:type="character" w:customStyle="1" w:styleId="Titre2Car">
     <w:name w:val="Titre 2 Car"/>
     <w:basedOn w:val="Policepardfaut"/>
     <w:link w:val="Titre2"/>
     <w:rsid w:val="00B67D76"/>
     <w:rPr>
-      <w:rFonts w:ascii="Arial" w:hAnsi="Arial" w:eastAsia="Times New Roman" w:cs="Arial"/>
+      <w:rFonts w:ascii="Arial" w:eastAsia="Times New Roman" w:hAnsi="Arial" w:cs="Arial"/>
       <w:b/>
       <w:sz w:val="24"/>
       <w:lang w:val="fr-FR" w:eastAsia="fr-FR"/>
     </w:rPr>
   </w:style>
-  <w:style w:type="character" w:styleId="Titre3Car" w:customStyle="1">
+  <w:style w:type="character" w:customStyle="1" w:styleId="Titre3Car">
     <w:name w:val="Titre 3 Car"/>
     <w:basedOn w:val="Policepardfaut"/>
     <w:link w:val="Titre3"/>
     <w:rsid w:val="00B67D76"/>
     <w:rPr>
-      <w:rFonts w:ascii="Arial" w:hAnsi="Arial" w:eastAsia="Times New Roman" w:cs="Arial"/>
+      <w:rFonts w:ascii="Arial" w:eastAsia="Times New Roman" w:hAnsi="Arial" w:cs="Arial"/>
       <w:b/>
       <w:bCs/>
       <w:sz w:val="24"/>
@@ -7616,13 +7427,13 @@
       <w:lang w:val="fr-FR" w:eastAsia="fr-FR"/>
     </w:rPr>
   </w:style>
-  <w:style w:type="character" w:styleId="Titre4Car" w:customStyle="1">
+  <w:style w:type="character" w:customStyle="1" w:styleId="Titre4Car">
     <w:name w:val="Titre 4 Car"/>
     <w:basedOn w:val="Policepardfaut"/>
     <w:link w:val="Titre4"/>
     <w:rsid w:val="00B67D76"/>
     <w:rPr>
-      <w:rFonts w:ascii="Times New Roman" w:hAnsi="Times New Roman" w:eastAsia="Times New Roman" w:cs="Times New Roman"/>
+      <w:rFonts w:ascii="Times New Roman" w:eastAsia="Times New Roman" w:hAnsi="Times New Roman" w:cs="Times New Roman"/>
       <w:b/>
       <w:bCs/>
       <w:sz w:val="28"/>
@@ -7630,13 +7441,13 @@
       <w:lang w:val="fr-FR" w:eastAsia="fr-FR"/>
     </w:rPr>
   </w:style>
-  <w:style w:type="character" w:styleId="Titre5Car" w:customStyle="1">
+  <w:style w:type="character" w:customStyle="1" w:styleId="Titre5Car">
     <w:name w:val="Titre 5 Car"/>
     <w:basedOn w:val="Policepardfaut"/>
     <w:link w:val="Titre5"/>
     <w:rsid w:val="00B67D76"/>
     <w:rPr>
-      <w:rFonts w:ascii="Arial" w:hAnsi="Arial" w:eastAsia="Times New Roman" w:cs="Times New Roman"/>
+      <w:rFonts w:ascii="Arial" w:eastAsia="Times New Roman" w:hAnsi="Arial" w:cs="Times New Roman"/>
       <w:b/>
       <w:bCs/>
       <w:i/>
@@ -7646,37 +7457,37 @@
       <w:lang w:val="fr-FR" w:eastAsia="fr-FR"/>
     </w:rPr>
   </w:style>
-  <w:style w:type="character" w:styleId="Titre6Car" w:customStyle="1">
+  <w:style w:type="character" w:customStyle="1" w:styleId="Titre6Car">
     <w:name w:val="Titre 6 Car"/>
     <w:basedOn w:val="Policepardfaut"/>
     <w:link w:val="Titre6"/>
     <w:rsid w:val="00B67D76"/>
     <w:rPr>
-      <w:rFonts w:ascii="Times New Roman" w:hAnsi="Times New Roman" w:eastAsia="Times New Roman" w:cs="Times New Roman"/>
+      <w:rFonts w:ascii="Times New Roman" w:eastAsia="Times New Roman" w:hAnsi="Times New Roman" w:cs="Times New Roman"/>
       <w:b/>
       <w:bCs/>
       <w:lang w:val="fr-FR" w:eastAsia="fr-FR"/>
     </w:rPr>
   </w:style>
-  <w:style w:type="character" w:styleId="Titre7Car" w:customStyle="1">
+  <w:style w:type="character" w:customStyle="1" w:styleId="Titre7Car">
     <w:name w:val="Titre 7 Car"/>
     <w:basedOn w:val="Policepardfaut"/>
     <w:link w:val="Titre7"/>
     <w:rsid w:val="00B67D76"/>
     <w:rPr>
-      <w:rFonts w:ascii="Times New Roman" w:hAnsi="Times New Roman" w:eastAsia="Times New Roman" w:cs="Times New Roman"/>
+      <w:rFonts w:ascii="Times New Roman" w:eastAsia="Times New Roman" w:hAnsi="Times New Roman" w:cs="Times New Roman"/>
       <w:sz w:val="24"/>
       <w:szCs w:val="24"/>
       <w:lang w:val="fr-FR" w:eastAsia="fr-FR"/>
     </w:rPr>
   </w:style>
-  <w:style w:type="character" w:styleId="Titre8Car" w:customStyle="1">
+  <w:style w:type="character" w:customStyle="1" w:styleId="Titre8Car">
     <w:name w:val="Titre 8 Car"/>
     <w:basedOn w:val="Policepardfaut"/>
     <w:link w:val="Titre8"/>
     <w:rsid w:val="00B67D76"/>
     <w:rPr>
-      <w:rFonts w:ascii="Times New Roman" w:hAnsi="Times New Roman" w:eastAsia="Times New Roman" w:cs="Times New Roman"/>
+      <w:rFonts w:ascii="Times New Roman" w:eastAsia="Times New Roman" w:hAnsi="Times New Roman" w:cs="Times New Roman"/>
       <w:i/>
       <w:iCs/>
       <w:sz w:val="24"/>
@@ -7684,13 +7495,13 @@
       <w:lang w:val="fr-FR" w:eastAsia="fr-FR"/>
     </w:rPr>
   </w:style>
-  <w:style w:type="character" w:styleId="Titre9Car" w:customStyle="1">
+  <w:style w:type="character" w:customStyle="1" w:styleId="Titre9Car">
     <w:name w:val="Titre 9 Car"/>
     <w:basedOn w:val="Policepardfaut"/>
     <w:link w:val="Titre9"/>
     <w:rsid w:val="00B67D76"/>
     <w:rPr>
-      <w:rFonts w:ascii="Arial" w:hAnsi="Arial" w:eastAsia="Times New Roman" w:cs="Arial"/>
+      <w:rFonts w:ascii="Arial" w:eastAsia="Times New Roman" w:hAnsi="Arial" w:cs="Arial"/>
       <w:lang w:val="fr-FR" w:eastAsia="fr-FR"/>
     </w:rPr>
   </w:style>
@@ -7706,13 +7517,13 @@
       </w:tabs>
     </w:pPr>
   </w:style>
-  <w:style w:type="character" w:styleId="En-tteCar" w:customStyle="1">
+  <w:style w:type="character" w:customStyle="1" w:styleId="En-tteCar">
     <w:name w:val="En-tête Car"/>
     <w:basedOn w:val="Policepardfaut"/>
     <w:link w:val="En-tte"/>
     <w:rsid w:val="00B67D76"/>
     <w:rPr>
-      <w:rFonts w:ascii="Arial" w:hAnsi="Arial" w:eastAsia="Times New Roman" w:cs="Times New Roman"/>
+      <w:rFonts w:ascii="Arial" w:eastAsia="Times New Roman" w:hAnsi="Arial" w:cs="Times New Roman"/>
       <w:lang w:val="fr-FR" w:eastAsia="fr-FR"/>
     </w:rPr>
   </w:style>
@@ -7728,13 +7539,13 @@
       </w:tabs>
     </w:pPr>
   </w:style>
-  <w:style w:type="character" w:styleId="PieddepageCar" w:customStyle="1">
+  <w:style w:type="character" w:customStyle="1" w:styleId="PieddepageCar">
     <w:name w:val="Pied de page Car"/>
     <w:basedOn w:val="Policepardfaut"/>
     <w:link w:val="Pieddepage"/>
     <w:rsid w:val="00B67D76"/>
     <w:rPr>
-      <w:rFonts w:ascii="Arial" w:hAnsi="Arial" w:eastAsia="Times New Roman" w:cs="Times New Roman"/>
+      <w:rFonts w:ascii="Arial" w:eastAsia="Times New Roman" w:hAnsi="Arial" w:cs="Times New Roman"/>
       <w:lang w:val="fr-FR" w:eastAsia="fr-FR"/>
     </w:rPr>
   </w:style>
@@ -7748,7 +7559,7 @@
       <w:u w:val="single"/>
     </w:rPr>
   </w:style>
-  <w:style w:type="paragraph" w:styleId="paragraphe1" w:customStyle="1">
+  <w:style w:type="paragraph" w:customStyle="1" w:styleId="paragraphe1">
     <w:name w:val="paragraphe1"/>
     <w:basedOn w:val="Normal"/>
     <w:rsid w:val="00B67D76"/>
@@ -7768,17 +7579,17 @@
       <w:spacing w:after="120"/>
     </w:pPr>
   </w:style>
-  <w:style w:type="character" w:styleId="CorpsdetexteCar" w:customStyle="1">
+  <w:style w:type="character" w:customStyle="1" w:styleId="CorpsdetexteCar">
     <w:name w:val="Corps de texte Car"/>
     <w:basedOn w:val="Policepardfaut"/>
     <w:link w:val="Corpsdetexte"/>
     <w:rsid w:val="00B67D76"/>
     <w:rPr>
-      <w:rFonts w:ascii="Arial" w:hAnsi="Arial" w:eastAsia="Times New Roman" w:cs="Times New Roman"/>
+      <w:rFonts w:ascii="Arial" w:eastAsia="Times New Roman" w:hAnsi="Arial" w:cs="Times New Roman"/>
       <w:lang w:val="fr-FR" w:eastAsia="fr-FR"/>
     </w:rPr>
   </w:style>
-  <w:style w:type="paragraph" w:styleId="TexteTableau" w:customStyle="1">
+  <w:style w:type="paragraph" w:customStyle="1" w:styleId="TexteTableau">
     <w:name w:val="TexteTableau"/>
     <w:basedOn w:val="Corpsdetexte"/>
     <w:rsid w:val="00B67D76"/>
@@ -7786,7 +7597,7 @@
       <w:spacing w:before="60" w:after="60"/>
     </w:pPr>
   </w:style>
-  <w:style w:type="paragraph" w:styleId="NOM" w:customStyle="1">
+  <w:style w:type="paragraph" w:customStyle="1" w:styleId="NOM">
     <w:name w:val="NOM"/>
     <w:basedOn w:val="Corpsdetexte"/>
     <w:next w:val="Corpsdetexte"/>
@@ -7800,13 +7611,13 @@
       <w:caps/>
     </w:rPr>
   </w:style>
-  <w:style w:type="character" w:styleId="NOMCar" w:customStyle="1">
+  <w:style w:type="character" w:customStyle="1" w:styleId="NOMCar">
     <w:name w:val="NOM Car"/>
     <w:basedOn w:val="CorpsdetexteCar"/>
     <w:link w:val="NOM"/>
     <w:rsid w:val="00B67D76"/>
     <w:rPr>
-      <w:rFonts w:ascii="Arial" w:hAnsi="Arial" w:eastAsia="Times New Roman" w:cs="Times New Roman"/>
+      <w:rFonts w:ascii="Arial" w:eastAsia="Times New Roman" w:hAnsi="Arial" w:cs="Times New Roman"/>
       <w:b/>
       <w:caps/>
       <w:lang w:val="fr-FR" w:eastAsia="fr-FR"/>
@@ -7826,7 +7637,7 @@
       <w:szCs w:val="16"/>
     </w:rPr>
   </w:style>
-  <w:style w:type="character" w:styleId="TextedebullesCar" w:customStyle="1">
+  <w:style w:type="character" w:customStyle="1" w:styleId="TextedebullesCar">
     <w:name w:val="Texte de bulles Car"/>
     <w:basedOn w:val="Policepardfaut"/>
     <w:link w:val="Textedebulles"/>
@@ -7834,7 +7645,7 @@
     <w:semiHidden/>
     <w:rsid w:val="00465C81"/>
     <w:rPr>
-      <w:rFonts w:ascii="Tahoma" w:hAnsi="Tahoma" w:eastAsia="Times New Roman" w:cs="Tahoma"/>
+      <w:rFonts w:ascii="Tahoma" w:eastAsia="Times New Roman" w:hAnsi="Tahoma" w:cs="Tahoma"/>
       <w:sz w:val="16"/>
       <w:szCs w:val="16"/>
       <w:lang w:val="fr-FR" w:eastAsia="fr-FR"/>
@@ -7852,7 +7663,7 @@
       <w:szCs w:val="20"/>
     </w:rPr>
   </w:style>
-  <w:style w:type="character" w:styleId="NotedebasdepageCar" w:customStyle="1">
+  <w:style w:type="character" w:customStyle="1" w:styleId="NotedebasdepageCar">
     <w:name w:val="Note de bas de page Car"/>
     <w:basedOn w:val="Policepardfaut"/>
     <w:link w:val="Notedebasdepage"/>
@@ -7860,7 +7671,7 @@
     <w:semiHidden/>
     <w:rsid w:val="00ED24A1"/>
     <w:rPr>
-      <w:rFonts w:ascii="Arial" w:hAnsi="Arial" w:eastAsia="Times New Roman" w:cs="Times New Roman"/>
+      <w:rFonts w:ascii="Arial" w:eastAsia="Times New Roman" w:hAnsi="Arial" w:cs="Times New Roman"/>
       <w:sz w:val="20"/>
       <w:szCs w:val="20"/>
       <w:lang w:val="fr-FR" w:eastAsia="fr-FR"/>
@@ -7876,7 +7687,7 @@
       <w:vertAlign w:val="superscript"/>
     </w:rPr>
   </w:style>
-  <w:style w:type="paragraph" w:styleId="western" w:customStyle="1">
+  <w:style w:type="paragraph" w:customStyle="1" w:styleId="western">
     <w:name w:val="western"/>
     <w:basedOn w:val="Normal"/>
     <w:rsid w:val="004C4E1B"/>
@@ -7915,7 +7726,7 @@
 </file>
 
 <file path=word/theme/theme1.xml><?xml version="1.0" encoding="utf-8"?>
-<a:theme xmlns:a="http://schemas.openxmlformats.org/drawingml/2006/main" xmlns:thm15="http://schemas.microsoft.com/office/thememl/2012/main" name="Thème Office">
+<a:theme xmlns:a="http://schemas.openxmlformats.org/drawingml/2006/main" name="Thème Office">
   <a:themeElements>
     <a:clrScheme name="Office">
       <a:dk1>

</xml_diff>

<commit_message>
doc(CDC/Rapport): Ajout de clarifications
[42][Done]
</commit_message>
<xml_diff>
--- a/doc/E-P_Web294-CDC.docx
+++ b/doc/E-P_Web294-CDC.docx
@@ -76,23 +76,33 @@
                 <w:rFonts w:ascii="Century Gothic" w:hAnsi="Century Gothic"/>
               </w:rPr>
             </w:pPr>
+            <w:proofErr w:type="gramStart"/>
             <w:r>
               <w:rPr>
                 <w:rFonts w:ascii="Century Gothic" w:hAnsi="Century Gothic"/>
               </w:rPr>
               <w:t>Nom:</w:t>
             </w:r>
+            <w:proofErr w:type="gramEnd"/>
             <w:r>
               <w:rPr>
                 <w:rFonts w:ascii="Century Gothic" w:hAnsi="Century Gothic"/>
               </w:rPr>
               <w:tab/>
             </w:r>
-            <w:r>
-              <w:rPr>
-                <w:rFonts w:ascii="Century Gothic" w:hAnsi="Century Gothic"/>
-              </w:rPr>
-              <w:t xml:space="preserve">Junod &amp; Darbellay </w:t>
+            <w:proofErr w:type="spellStart"/>
+            <w:r>
+              <w:rPr>
+                <w:rFonts w:ascii="Century Gothic" w:hAnsi="Century Gothic"/>
+              </w:rPr>
+              <w:t>Junod</w:t>
+            </w:r>
+            <w:proofErr w:type="spellEnd"/>
+            <w:r>
+              <w:rPr>
+                <w:rFonts w:ascii="Century Gothic" w:hAnsi="Century Gothic"/>
+              </w:rPr>
+              <w:t xml:space="preserve"> &amp; Darbellay </w:t>
             </w:r>
           </w:p>
         </w:tc>
@@ -180,13 +190,27 @@
               <w:rPr>
                 <w:rFonts w:ascii="Century Gothic" w:hAnsi="Century Gothic"/>
               </w:rPr>
-              <w:t xml:space="preserve">   /  </w:t>
-            </w:r>
-            <w:r>
-              <w:rPr>
-                <w:rFonts w:ascii="Century Gothic" w:hAnsi="Century Gothic"/>
-              </w:rPr>
-              <w:t>Valmont 28b</w:t>
+              <w:t xml:space="preserve">   </w:t>
+            </w:r>
+            <w:proofErr w:type="gramStart"/>
+            <w:r>
+              <w:rPr>
+                <w:rFonts w:ascii="Century Gothic" w:hAnsi="Century Gothic"/>
+              </w:rPr>
+              <w:t xml:space="preserve">/  </w:t>
+            </w:r>
+            <w:r>
+              <w:rPr>
+                <w:rFonts w:ascii="Century Gothic" w:hAnsi="Century Gothic"/>
+              </w:rPr>
+              <w:t>Valmont</w:t>
+            </w:r>
+            <w:proofErr w:type="gramEnd"/>
+            <w:r>
+              <w:rPr>
+                <w:rFonts w:ascii="Century Gothic" w:hAnsi="Century Gothic"/>
+              </w:rPr>
+              <w:t xml:space="preserve"> 28b</w:t>
             </w:r>
             <w:r>
               <w:rPr>
@@ -239,24 +263,28 @@
                 <w:rFonts w:ascii="Century Gothic" w:hAnsi="Century Gothic"/>
               </w:rPr>
             </w:pPr>
+            <w:proofErr w:type="gramStart"/>
             <w:r>
               <w:rPr>
                 <w:rFonts w:ascii="Century Gothic" w:hAnsi="Century Gothic"/>
               </w:rPr>
               <w:t>Nom:</w:t>
             </w:r>
+            <w:proofErr w:type="gramEnd"/>
             <w:r>
               <w:rPr>
                 <w:rFonts w:ascii="Century Gothic" w:hAnsi="Century Gothic"/>
               </w:rPr>
               <w:tab/>
             </w:r>
+            <w:proofErr w:type="spellStart"/>
             <w:r>
               <w:rPr>
                 <w:rFonts w:ascii="Century Gothic" w:hAnsi="Century Gothic"/>
               </w:rPr>
               <w:t>Charmier</w:t>
             </w:r>
+            <w:proofErr w:type="spellEnd"/>
           </w:p>
         </w:tc>
         <w:tc>
@@ -275,6 +303,7 @@
                 <w:b w:val="0"/>
               </w:rPr>
             </w:pPr>
+            <w:proofErr w:type="gramStart"/>
             <w:r>
               <w:rPr>
                 <w:rFonts w:ascii="Century Gothic" w:hAnsi="Century Gothic"/>
@@ -297,6 +326,7 @@
               </w:rPr>
               <w:t>:</w:t>
             </w:r>
+            <w:proofErr w:type="gramEnd"/>
             <w:r>
               <w:rPr>
                 <w:rFonts w:ascii="Century Gothic" w:hAnsi="Century Gothic"/>
@@ -817,7 +847,21 @@
         <w:rPr>
           <w:rFonts w:ascii="Century Gothic" w:hAnsi="Century Gothic"/>
         </w:rPr>
-        <w:t>Chaque apprenti travaille sur tous les aspects du projet (code, documentation, tests, etc)</w:t>
+        <w:t xml:space="preserve">Chaque apprenti travaille sur tous les aspects du projet (code, documentation, tests, </w:t>
+      </w:r>
+      <w:proofErr w:type="spellStart"/>
+      <w:r>
+        <w:rPr>
+          <w:rFonts w:ascii="Century Gothic" w:hAnsi="Century Gothic"/>
+        </w:rPr>
+        <w:t>etc</w:t>
+      </w:r>
+      <w:proofErr w:type="spellEnd"/>
+      <w:r>
+        <w:rPr>
+          <w:rFonts w:ascii="Century Gothic" w:hAnsi="Century Gothic"/>
+        </w:rPr>
+        <w:t>)</w:t>
       </w:r>
     </w:p>
     <w:bookmarkEnd w:id="0"/>
@@ -1019,12 +1063,16 @@
                 <w:rFonts w:ascii="Century Gothic" w:hAnsi="Century Gothic"/>
               </w:rPr>
             </w:pPr>
+            <w:proofErr w:type="spellStart"/>
+            <w:proofErr w:type="gramStart"/>
             <w:r>
               <w:rPr>
                 <w:rFonts w:ascii="Century Gothic" w:hAnsi="Century Gothic"/>
               </w:rPr>
               <w:t>vscode</w:t>
             </w:r>
+            <w:proofErr w:type="spellEnd"/>
+            <w:proofErr w:type="gramEnd"/>
           </w:p>
           <w:p>
             <w:pPr>
@@ -1557,6 +1605,7 @@
               <w:t xml:space="preserve">allons utiliser </w:t>
             </w:r>
             <w:hyperlink r:id="rId8" w:history="1">
+              <w:proofErr w:type="spellStart"/>
               <w:r>
                 <w:rPr>
                   <w:rStyle w:val="Lienhypertexte"/>
@@ -1564,7 +1613,17 @@
                   <w:sz w:val="22"/>
                   <w:lang w:val="fr-CH" w:eastAsia="fr-CH"/>
                 </w:rPr>
-                <w:t>My JSON Server</w:t>
+                <w:t>My</w:t>
+              </w:r>
+              <w:proofErr w:type="spellEnd"/>
+              <w:r>
+                <w:rPr>
+                  <w:rStyle w:val="Lienhypertexte"/>
+                  <w:rFonts w:ascii="Century Gothic" w:hAnsi="Century Gothic"/>
+                  <w:sz w:val="22"/>
+                  <w:lang w:val="fr-CH" w:eastAsia="fr-CH"/>
+                </w:rPr>
+                <w:t xml:space="preserve"> JSON Server</w:t>
               </w:r>
             </w:hyperlink>
             <w:r>
@@ -1572,7 +1631,23 @@
                 <w:rFonts w:ascii="Century Gothic" w:hAnsi="Century Gothic"/>
                 <w:lang w:val="fr-CH" w:eastAsia="fr-CH"/>
               </w:rPr>
-              <w:t xml:space="preserve"> (basé sur le célèbre outil json-server) </w:t>
+              <w:t xml:space="preserve"> (basé sur le célèbre outil </w:t>
+            </w:r>
+            <w:proofErr w:type="spellStart"/>
+            <w:r>
+              <w:rPr>
+                <w:rFonts w:ascii="Century Gothic" w:hAnsi="Century Gothic"/>
+                <w:lang w:val="fr-CH" w:eastAsia="fr-CH"/>
+              </w:rPr>
+              <w:t>json</w:t>
+            </w:r>
+            <w:proofErr w:type="spellEnd"/>
+            <w:r>
+              <w:rPr>
+                <w:rFonts w:ascii="Century Gothic" w:hAnsi="Century Gothic"/>
+                <w:lang w:val="fr-CH" w:eastAsia="fr-CH"/>
+              </w:rPr>
+              <w:t xml:space="preserve">-server) </w:t>
             </w:r>
             <w:r>
               <w:rPr>
@@ -1700,8 +1775,16 @@
               <w:rPr>
                 <w:rFonts w:ascii="Century Gothic" w:hAnsi="Century Gothic"/>
               </w:rPr>
-              <w:t xml:space="preserve"> un outil comme Figma</w:t>
-            </w:r>
+              <w:t xml:space="preserve"> un outil comme </w:t>
+            </w:r>
+            <w:proofErr w:type="spellStart"/>
+            <w:r>
+              <w:rPr>
+                <w:rFonts w:ascii="Century Gothic" w:hAnsi="Century Gothic"/>
+              </w:rPr>
+              <w:t>Figma</w:t>
+            </w:r>
+            <w:proofErr w:type="spellEnd"/>
             <w:r>
               <w:rPr>
                 <w:rFonts w:ascii="Century Gothic" w:hAnsi="Century Gothic"/>
@@ -2467,11 +2550,19 @@
               </w:rPr>
               <w:t xml:space="preserve"> (lien relatif vers un fichier </w:t>
             </w:r>
-            <w:r>
-              <w:rPr>
-                <w:rFonts w:ascii="Century Gothic" w:hAnsi="Century Gothic"/>
-              </w:rPr>
-              <w:t>pdf d’une page d</w:t>
+            <w:proofErr w:type="spellStart"/>
+            <w:r>
+              <w:rPr>
+                <w:rFonts w:ascii="Century Gothic" w:hAnsi="Century Gothic"/>
+              </w:rPr>
+              <w:t>pdf</w:t>
+            </w:r>
+            <w:proofErr w:type="spellEnd"/>
+            <w:r>
+              <w:rPr>
+                <w:rFonts w:ascii="Century Gothic" w:hAnsi="Century Gothic"/>
+              </w:rPr>
+              <w:t xml:space="preserve"> d’une page d</w:t>
             </w:r>
             <w:r>
               <w:rPr>
@@ -2689,47 +2780,41 @@
               <w:jc w:val="both"/>
               <w:rPr>
                 <w:rFonts w:ascii="Century Gothic" w:hAnsi="Century Gothic"/>
+                <w:strike/>
               </w:rPr>
             </w:pPr>
             <w:r>
               <w:rPr>
                 <w:rFonts w:ascii="Century Gothic" w:hAnsi="Century Gothic"/>
-              </w:rPr>
-              <w:t>Un utilisateur est défini par un pseudo, une date d'entrée dans le site, du nombre d</w:t>
-            </w:r>
-            <w:r>
-              <w:rPr>
-                <w:rFonts w:ascii="Century Gothic" w:hAnsi="Century Gothic"/>
-              </w:rPr>
-              <w:t xml:space="preserve">’ouvrages </w:t>
-            </w:r>
-            <w:r>
-              <w:rPr>
-                <w:rFonts w:ascii="Century Gothic" w:hAnsi="Century Gothic"/>
-              </w:rPr>
-              <w:t>proposés et du nombre d'</w:t>
-            </w:r>
-            <w:r>
-              <w:rPr>
-                <w:rFonts w:ascii="Century Gothic" w:hAnsi="Century Gothic"/>
+                <w:strike/>
+              </w:rPr>
+              <w:t>Un utilisateur est défini par un pseudo, une date d'entrée dans le site, du nombre d’ouvrages proposés et du nombre d'</w:t>
+            </w:r>
+            <w:r>
+              <w:rPr>
+                <w:rFonts w:ascii="Century Gothic" w:hAnsi="Century Gothic"/>
+                <w:strike/>
               </w:rPr>
               <w:t>appréciation</w:t>
             </w:r>
             <w:r>
               <w:rPr>
                 <w:rFonts w:ascii="Century Gothic" w:hAnsi="Century Gothic"/>
+                <w:strike/>
               </w:rPr>
               <w:t>s</w:t>
             </w:r>
             <w:r>
               <w:rPr>
                 <w:rFonts w:ascii="Century Gothic" w:hAnsi="Century Gothic"/>
+                <w:strike/>
               </w:rPr>
               <w:t xml:space="preserve"> et de commentaires</w:t>
             </w:r>
             <w:r>
               <w:rPr>
                 <w:rFonts w:ascii="Century Gothic" w:hAnsi="Century Gothic"/>
+                <w:strike/>
               </w:rPr>
               <w:t xml:space="preserve"> faits.</w:t>
             </w:r>
@@ -2814,38 +2899,50 @@
             <w:r>
               <w:rPr>
                 <w:rFonts w:ascii="Century Gothic" w:hAnsi="Century Gothic"/>
+                <w:strike/>
               </w:rPr>
               <w:t xml:space="preserve">Sur la page de la liste des </w:t>
             </w:r>
             <w:r>
               <w:rPr>
                 <w:rFonts w:ascii="Century Gothic" w:hAnsi="Century Gothic"/>
+                <w:strike/>
               </w:rPr>
               <w:t>ouvrages</w:t>
             </w:r>
             <w:r>
               <w:rPr>
                 <w:rFonts w:ascii="Century Gothic" w:hAnsi="Century Gothic"/>
+                <w:strike/>
               </w:rPr>
               <w:t xml:space="preserve">, il doit être possible de visualiser le </w:t>
             </w:r>
             <w:r>
               <w:rPr>
                 <w:rFonts w:ascii="Century Gothic" w:hAnsi="Century Gothic"/>
+                <w:strike/>
               </w:rPr>
               <w:t>titre,</w:t>
             </w:r>
             <w:r>
               <w:rPr>
                 <w:rFonts w:ascii="Century Gothic" w:hAnsi="Century Gothic"/>
+                <w:strike/>
               </w:rPr>
               <w:t xml:space="preserve"> l’a</w:t>
             </w:r>
             <w:r>
               <w:rPr>
                 <w:rFonts w:ascii="Century Gothic" w:hAnsi="Century Gothic"/>
-              </w:rPr>
-              <w:t>uteur ainsi que le pseudo de la personne qui a posté l’ouvrage. Ceci doit être possible par catégorie.</w:t>
+                <w:strike/>
+              </w:rPr>
+              <w:t>uteur ainsi que le pseudo de la personne qui a posté l’ouvrage.</w:t>
+            </w:r>
+            <w:r>
+              <w:rPr>
+                <w:rFonts w:ascii="Century Gothic" w:hAnsi="Century Gothic"/>
+              </w:rPr>
+              <w:t xml:space="preserve"> Ceci doit être possible par catégorie.</w:t>
             </w:r>
           </w:p>
           <w:p>
@@ -2854,11 +2951,13 @@
               <w:jc w:val="both"/>
               <w:rPr>
                 <w:rFonts w:ascii="Century Gothic" w:hAnsi="Century Gothic"/>
+                <w:strike/>
               </w:rPr>
             </w:pPr>
             <w:r>
               <w:rPr>
                 <w:rFonts w:ascii="Century Gothic" w:hAnsi="Century Gothic"/>
+                <w:strike/>
               </w:rPr>
               <w:t>Pour chaque ouvrage, il est possible en cliquant sur le titre ou le pseudo, de voir les détails de l’ouvrage ou de la personne.</w:t>
             </w:r>
@@ -2937,11 +3036,13 @@
               <w:jc w:val="both"/>
               <w:rPr>
                 <w:rFonts w:ascii="Century Gothic" w:hAnsi="Century Gothic"/>
+                <w:strike/>
               </w:rPr>
             </w:pPr>
             <w:r>
               <w:rPr>
                 <w:rFonts w:ascii="Century Gothic" w:hAnsi="Century Gothic"/>
+                <w:strike/>
               </w:rPr>
               <w:t>Pour la personne, il est possible de voir les informations, le nombre d’ouvrages proposés.</w:t>
             </w:r>
@@ -2958,7 +3059,20 @@
               <w:rPr>
                 <w:rFonts w:ascii="Century Gothic" w:hAnsi="Century Gothic"/>
               </w:rPr>
-              <w:t>Sur la page de la liste des ouvrages, il doit être possible de visualiser le titre, l’auteur ainsi que le pseudo de la personne qui a posté l’ouvrage. Ceci doit être possible par catégorie.</w:t>
+              <w:t xml:space="preserve">Sur la page de la liste des ouvrages, il doit être possible de visualiser le titre, l’auteur </w:t>
+            </w:r>
+            <w:r>
+              <w:rPr>
+                <w:rFonts w:ascii="Century Gothic" w:hAnsi="Century Gothic"/>
+                <w:strike/>
+              </w:rPr>
+              <w:t>ainsi que le pseudo de la personne qui a posté l’ouvrage</w:t>
+            </w:r>
+            <w:r>
+              <w:rPr>
+                <w:rFonts w:ascii="Century Gothic" w:hAnsi="Century Gothic"/>
+              </w:rPr>
+              <w:t>. Ceci doit être possible par catégorie.</w:t>
             </w:r>
           </w:p>
         </w:tc>
@@ -3106,8 +3220,16 @@
         <w:rPr>
           <w:rFonts w:ascii="Century Gothic" w:hAnsi="Century Gothic"/>
         </w:rPr>
-        <w:t xml:space="preserve"> et github</w:t>
-      </w:r>
+        <w:t xml:space="preserve"> et </w:t>
+      </w:r>
+      <w:proofErr w:type="spellStart"/>
+      <w:r>
+        <w:rPr>
+          <w:rFonts w:ascii="Century Gothic" w:hAnsi="Century Gothic"/>
+        </w:rPr>
+        <w:t>github</w:t>
+      </w:r>
+      <w:proofErr w:type="spellEnd"/>
     </w:p>
     <w:p>
       <w:pPr>
@@ -3121,11 +3243,19 @@
           <w:rFonts w:ascii="Century Gothic" w:hAnsi="Century Gothic"/>
         </w:rPr>
       </w:pPr>
-      <w:r>
-        <w:rPr>
-          <w:rFonts w:ascii="Century Gothic" w:hAnsi="Century Gothic"/>
-        </w:rPr>
-        <w:t>Json server</w:t>
+      <w:proofErr w:type="spellStart"/>
+      <w:r>
+        <w:rPr>
+          <w:rFonts w:ascii="Century Gothic" w:hAnsi="Century Gothic"/>
+        </w:rPr>
+        <w:t>Json</w:t>
+      </w:r>
+      <w:proofErr w:type="spellEnd"/>
+      <w:r>
+        <w:rPr>
+          <w:rFonts w:ascii="Century Gothic" w:hAnsi="Century Gothic"/>
+        </w:rPr>
+        <w:t xml:space="preserve"> server</w:t>
       </w:r>
     </w:p>
     <w:p>
@@ -3308,7 +3438,21 @@
         <w:rPr>
           <w:rFonts w:ascii="Century Gothic" w:hAnsi="Century Gothic"/>
         </w:rPr>
-        <w:t>Planification de toutes les tâches à réaliser : Vous devez utiliser un outil permettant au chef de projet de voir l’évolution des tâches (github projet)</w:t>
+        <w:t>Planification de toutes les tâches à réaliser : Vous devez utiliser un outil permettant au chef de projet de voir l’évolution des tâches (</w:t>
+      </w:r>
+      <w:proofErr w:type="spellStart"/>
+      <w:r>
+        <w:rPr>
+          <w:rFonts w:ascii="Century Gothic" w:hAnsi="Century Gothic"/>
+        </w:rPr>
+        <w:t>github</w:t>
+      </w:r>
+      <w:proofErr w:type="spellEnd"/>
+      <w:r>
+        <w:rPr>
+          <w:rFonts w:ascii="Century Gothic" w:hAnsi="Century Gothic"/>
+        </w:rPr>
+        <w:t xml:space="preserve"> projet)</w:t>
       </w:r>
       <w:r>
         <w:rPr>
@@ -3447,8 +3591,16 @@
         <w:rPr>
           <w:rFonts w:ascii="Century Gothic" w:hAnsi="Century Gothic"/>
         </w:rPr>
-        <w:t>Comprend une explication de l’organisation du groupe quant à la gestion du code avec git/github</w:t>
-      </w:r>
+        <w:t>Comprend une explication de l’organisation du groupe quant à la gestion du code avec git/</w:t>
+      </w:r>
+      <w:proofErr w:type="spellStart"/>
+      <w:r>
+        <w:rPr>
+          <w:rFonts w:ascii="Century Gothic" w:hAnsi="Century Gothic"/>
+        </w:rPr>
+        <w:t>github</w:t>
+      </w:r>
+      <w:proofErr w:type="spellEnd"/>
       <w:r>
         <w:rPr>
           <w:rFonts w:ascii="Century Gothic" w:hAnsi="Century Gothic"/>
@@ -4842,7 +4994,7 @@
         </mc:Choice>
         <mc:Fallback>
           <w:pict>
-            <v:line w14:anchorId="7799E44D" id="Line 2" o:spid="_x0000_s1026" style="position:absolute;z-index:251658240;visibility:visible;mso-wrap-style:square;mso-width-percent:0;mso-height-percent:0;mso-wrap-distance-left:9pt;mso-wrap-distance-top:0;mso-wrap-distance-right:9pt;mso-wrap-distance-bottom:0;mso-position-horizontal:absolute;mso-position-horizontal-relative:text;mso-position-vertical:absolute;mso-position-vertical-relative:text;mso-width-percent:0;mso-height-percent:0;mso-width-relative:page;mso-height-relative:page" from="-.5pt,-.1pt" to="496.35pt,-.1pt" o:gfxdata="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"/>
+            <v:line w14:anchorId="1F9BDDC5" id="Line 2" o:spid="_x0000_s1026" style="position:absolute;z-index:251658240;visibility:visible;mso-wrap-style:square;mso-width-percent:0;mso-height-percent:0;mso-wrap-distance-left:9pt;mso-wrap-distance-top:0;mso-wrap-distance-right:9pt;mso-wrap-distance-bottom:0;mso-position-horizontal:absolute;mso-position-horizontal-relative:text;mso-position-vertical:absolute;mso-position-vertical-relative:text;mso-width-percent:0;mso-height-percent:0;mso-width-relative:page;mso-height-relative:page" from="-.5pt,-.1pt" to="496.35pt,-.1pt" o:gfxdata="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"/>
           </w:pict>
         </mc:Fallback>
       </mc:AlternateContent>
@@ -5060,7 +5212,7 @@
         <w:snapToGrid w:val="0"/>
         <w:sz w:val="12"/>
       </w:rPr>
-      <w:t>10:41</w:t>
+      <w:t>11:18</w:t>
     </w:r>
     <w:r>
       <w:rPr>
@@ -5564,8 +5716,13 @@
             <w:jc w:val="right"/>
           </w:pPr>
           <w:r>
-            <w:t>Projet : xxxxxx</w:t>
+            <w:t xml:space="preserve">Projet : </w:t>
           </w:r>
+          <w:proofErr w:type="spellStart"/>
+          <w:r>
+            <w:t>xxxxxx</w:t>
+          </w:r>
+          <w:proofErr w:type="spellEnd"/>
         </w:p>
       </w:tc>
     </w:tr>

</xml_diff>